<commit_message>
Add slicing operations for a 2D list and update Tower of Hanoi implementation; include roll number in assignment report
</commit_message>
<xml_diff>
--- a/First Semester/Python/Lab Task/Lab Report- Assignment 1.docx
+++ b/First Semester/Python/Lab Task/Lab Report- Assignment 1.docx
@@ -258,9 +258,6 @@
         </w:tabs>
         <w:spacing w:after="0"/>
         <w:jc w:val="center"/>
-        <w:rPr>
-          <w:color w:val="000000"/>
-        </w:rPr>
       </w:pPr>
       <w:bookmarkStart w:id="0" w:name="_heading=h.gjdgxs" w:colFirst="0" w:colLast="0"/>
       <w:bookmarkEnd w:id="0"/>
@@ -268,10 +265,40 @@
         <w:rPr>
           <w:color w:val="000000"/>
         </w:rPr>
-        <w:t xml:space="preserve">   Name:</w:t>
+        <w:t xml:space="preserve">   </w:t>
+      </w:r>
+      <w:r>
+        <w:rPr>
+          <w:b/>
+          <w:bCs/>
+          <w:color w:val="000000"/>
+        </w:rPr>
+        <w:t>Name:</w:t>
       </w:r>
       <w:r>
         <w:t xml:space="preserve"> Bishal Rijal</w:t>
+      </w:r>
+    </w:p>
+    <w:p>
+      <w:pPr>
+        <w:tabs>
+          <w:tab w:val="left" w:pos="630"/>
+        </w:tabs>
+        <w:spacing w:after="0"/>
+        <w:jc w:val="center"/>
+        <w:rPr>
+          <w:color w:val="000000"/>
+        </w:rPr>
+      </w:pPr>
+      <w:r>
+        <w:rPr>
+          <w:b/>
+          <w:bCs/>
+        </w:rPr>
+        <w:t>Roll No.:</w:t>
+      </w:r>
+      <w:r>
+        <w:t xml:space="preserve"> 6(Six)</w:t>
       </w:r>
     </w:p>
     <w:p>
@@ -7583,28 +7610,28 @@
 </file>
 
 <file path=customXml/item1.xml><?xml version="1.0" encoding="utf-8"?>
+<b:Sources xmlns:b="http://schemas.openxmlformats.org/officeDocument/2006/bibliography" xmlns="http://schemas.openxmlformats.org/officeDocument/2006/bibliography" SelectedStyle="\APASixthEditionOfficeOnline.xsl" StyleName="APA" Version="6"/>
+</file>
+
+<file path=customXml/item2.xml><?xml version="1.0" encoding="utf-8"?>
 <go:gDocsCustomXmlDataStorage xmlns:go="http://customooxmlschemas.google.com/" xmlns:r="http://schemas.openxmlformats.org/officeDocument/2006/relationships" uri="GoogleDocsCustomDataVersion2">
   <go:docsCustomData xmlns:go="http://customooxmlschemas.google.com/" roundtripDataSignature="AMtx7mhNdRNjg0bVM+xvUCna7odF+TVm+w==">CgMxLjAyCGguZ2pkZ3hzOAByITE1eGM4dkVsTTF2T0t5TEcySXJURWw4aFNGeFh5WmJHRQ==</go:docsCustomData>
 </go:gDocsCustomXmlDataStorage>
 </file>
 
-<file path=customXml/item2.xml><?xml version="1.0" encoding="utf-8"?>
-<b:Sources xmlns:b="http://schemas.openxmlformats.org/officeDocument/2006/bibliography" xmlns="http://schemas.openxmlformats.org/officeDocument/2006/bibliography" SelectedStyle="\APASixthEditionOfficeOnline.xsl" StyleName="APA" Version="6"/>
+<file path=customXml/itemProps1.xml><?xml version="1.0" encoding="utf-8"?>
+<ds:datastoreItem xmlns:ds="http://schemas.openxmlformats.org/officeDocument/2006/customXml" ds:itemID="{794EAF63-1631-48A4-9EEB-A95A78F193C5}">
+  <ds:schemaRefs>
+    <ds:schemaRef ds:uri="http://schemas.openxmlformats.org/officeDocument/2006/bibliography"/>
+  </ds:schemaRefs>
+</ds:datastoreItem>
 </file>
 
-<file path=customXml/itemProps1.xml><?xml version="1.0" encoding="utf-8"?>
+<file path=customXml/itemProps2.xml><?xml version="1.0" encoding="utf-8"?>
 <ds:datastoreItem xmlns:ds="http://schemas.openxmlformats.org/officeDocument/2006/customXml" ds:itemID="{11111111-1234-1234-1234-123412341234}">
   <ds:schemaRefs>
     <ds:schemaRef ds:uri="http://customooxmlschemas.google.com/"/>
     <ds:schemaRef ds:uri="http://schemas.openxmlformats.org/officeDocument/2006/relationships"/>
   </ds:schemaRefs>
 </ds:datastoreItem>
-</file>
-
-<file path=customXml/itemProps2.xml><?xml version="1.0" encoding="utf-8"?>
-<ds:datastoreItem xmlns:ds="http://schemas.openxmlformats.org/officeDocument/2006/customXml" ds:itemID="{794EAF63-1631-48A4-9EEB-A95A78F193C5}">
-  <ds:schemaRefs>
-    <ds:schemaRef ds:uri="http://schemas.openxmlformats.org/officeDocument/2006/bibliography"/>
-  </ds:schemaRefs>
-</ds:datastoreItem>
 </file>
</xml_diff>

<commit_message>
Assignment 1 and 2 completed
</commit_message>
<xml_diff>
--- a/First Semester/Python/Lab Task/Lab Report- Assignment 1.docx
+++ b/First Semester/Python/Lab Task/Lab Report- Assignment 1.docx
@@ -108,19 +108,11 @@
           <w:color w:val="000000"/>
         </w:rPr>
       </w:pPr>
-      <w:proofErr w:type="spellStart"/>
-      <w:r>
-        <w:rPr>
-          <w:color w:val="000000"/>
-        </w:rPr>
-        <w:t>Kirtipur</w:t>
-      </w:r>
-      <w:proofErr w:type="spellEnd"/>
-      <w:r>
-        <w:rPr>
-          <w:color w:val="000000"/>
-        </w:rPr>
-        <w:t>, Kathmandu</w:t>
+      <w:r>
+        <w:rPr>
+          <w:color w:val="000000"/>
+        </w:rPr>
+        <w:t>Kirtipur, Kathmandu</w:t>
       </w:r>
     </w:p>
     <w:p>
@@ -387,19 +379,11 @@
           <w:color w:val="000000"/>
         </w:rPr>
       </w:pPr>
-      <w:proofErr w:type="spellStart"/>
-      <w:r>
-        <w:rPr>
-          <w:color w:val="000000"/>
-        </w:rPr>
-        <w:t>Patandhoka</w:t>
-      </w:r>
-      <w:proofErr w:type="spellEnd"/>
-      <w:r>
-        <w:rPr>
-          <w:color w:val="000000"/>
-        </w:rPr>
-        <w:t>, Lalitpur</w:t>
+      <w:r>
+        <w:rPr>
+          <w:color w:val="000000"/>
+        </w:rPr>
+        <w:t>Patandhoka, Lalitpur</w:t>
       </w:r>
     </w:p>
     <w:p>
@@ -711,7 +695,14 @@
           <w:b/>
           <w:color w:val="000000"/>
         </w:rPr>
-        <w:t>May- 202</w:t>
+        <w:t xml:space="preserve">Jun </w:t>
+      </w:r>
+      <w:r>
+        <w:rPr>
+          <w:b/>
+          <w:color w:val="000000"/>
+        </w:rPr>
+        <w:t>- 202</w:t>
       </w:r>
       <w:r>
         <w:rPr>
@@ -1641,71 +1632,28 @@
           <w:color w:val="000000"/>
         </w:rPr>
       </w:pPr>
-      <w:proofErr w:type="spellStart"/>
-      <w:r>
-        <w:rPr>
-          <w:bCs/>
-          <w:color w:val="000000"/>
-        </w:rPr>
-        <w:t>nepali_rupees</w:t>
-      </w:r>
-      <w:proofErr w:type="spellEnd"/>
-      <w:r>
-        <w:rPr>
-          <w:bCs/>
-          <w:color w:val="000000"/>
-        </w:rPr>
-        <w:t xml:space="preserve"> = (dollar * 133.72) + (riyal * 35.82)</w:t>
-      </w:r>
-    </w:p>
-    <w:p>
-      <w:pPr>
-        <w:spacing w:after="0" w:line="240" w:lineRule="auto"/>
-        <w:rPr>
-          <w:bCs/>
-          <w:color w:val="000000"/>
-        </w:rPr>
-      </w:pPr>
-      <w:proofErr w:type="gramStart"/>
-      <w:r>
-        <w:rPr>
-          <w:bCs/>
-          <w:color w:val="000000"/>
-        </w:rPr>
-        <w:t>print(</w:t>
-      </w:r>
-      <w:proofErr w:type="spellStart"/>
-      <w:proofErr w:type="gramEnd"/>
-      <w:r>
-        <w:rPr>
-          <w:bCs/>
-          <w:color w:val="000000"/>
-        </w:rPr>
-        <w:t>f"Total</w:t>
-      </w:r>
-      <w:proofErr w:type="spellEnd"/>
-      <w:r>
-        <w:rPr>
-          <w:bCs/>
-          <w:color w:val="000000"/>
-        </w:rPr>
-        <w:t xml:space="preserve"> currency in NRs: {</w:t>
-      </w:r>
-      <w:proofErr w:type="spellStart"/>
-      <w:r>
-        <w:rPr>
-          <w:bCs/>
-          <w:color w:val="000000"/>
-        </w:rPr>
-        <w:t>nepali_rupees</w:t>
-      </w:r>
-      <w:proofErr w:type="spellEnd"/>
-      <w:r>
-        <w:rPr>
-          <w:bCs/>
-          <w:color w:val="000000"/>
-        </w:rPr>
-        <w:t>}")</w:t>
+      <w:r>
+        <w:rPr>
+          <w:bCs/>
+          <w:color w:val="000000"/>
+        </w:rPr>
+        <w:t>nepali_rupees = (dollar * 133.72) + (riyal * 35.82)</w:t>
+      </w:r>
+    </w:p>
+    <w:p>
+      <w:pPr>
+        <w:spacing w:after="0" w:line="240" w:lineRule="auto"/>
+        <w:rPr>
+          <w:bCs/>
+          <w:color w:val="000000"/>
+        </w:rPr>
+      </w:pPr>
+      <w:r>
+        <w:rPr>
+          <w:bCs/>
+          <w:color w:val="000000"/>
+        </w:rPr>
+        <w:t>print(f"Total currency in NRs: {nepali_rupees}")</w:t>
       </w:r>
     </w:p>
     <w:p>
@@ -1910,20 +1858,7 @@
         <w:t xml:space="preserve">2. </w:t>
       </w:r>
       <w:r>
-        <w:t xml:space="preserve">Given the initial deposit, the annual interest rate, and the number of years that you invest your money in an investment account. Calculate the final amount of the investment using </w:t>
-      </w:r>
-      <w:proofErr w:type="spellStart"/>
-      <w:proofErr w:type="gramStart"/>
-      <w:r>
-        <w:t>math.pow</w:t>
-      </w:r>
-      <w:proofErr w:type="spellEnd"/>
-      <w:r>
-        <w:t>(</w:t>
-      </w:r>
-      <w:proofErr w:type="gramEnd"/>
-      <w:r>
-        <w:t>) function.</w:t>
+        <w:t>Given the initial deposit, the annual interest rate, and the number of years that you invest your money in an investment account. Calculate the final amount of the investment using math.pow() function.</w:t>
       </w:r>
       <w:bookmarkEnd w:id="2"/>
     </w:p>
@@ -1965,205 +1900,80 @@
           <w:bCs/>
           <w:color w:val="000000"/>
         </w:rPr>
-        <w:t xml:space="preserve">deposit = </w:t>
-      </w:r>
-      <w:proofErr w:type="gramStart"/>
-      <w:r>
-        <w:rPr>
-          <w:bCs/>
-          <w:color w:val="000000"/>
-        </w:rPr>
-        <w:t>float(input(</w:t>
-      </w:r>
-      <w:proofErr w:type="gramEnd"/>
-      <w:r>
-        <w:rPr>
-          <w:bCs/>
-          <w:color w:val="000000"/>
-        </w:rPr>
-        <w:t>"Enter the initial deposit: "))</w:t>
-      </w:r>
-    </w:p>
-    <w:p>
-      <w:pPr>
-        <w:spacing w:after="0" w:line="240" w:lineRule="auto"/>
-        <w:rPr>
-          <w:bCs/>
-          <w:color w:val="000000"/>
-        </w:rPr>
-      </w:pPr>
-      <w:proofErr w:type="spellStart"/>
-      <w:r>
-        <w:rPr>
-          <w:bCs/>
-          <w:color w:val="000000"/>
-        </w:rPr>
-        <w:t>interest_rate</w:t>
-      </w:r>
-      <w:proofErr w:type="spellEnd"/>
-      <w:r>
-        <w:rPr>
-          <w:bCs/>
-          <w:color w:val="000000"/>
-        </w:rPr>
-        <w:t xml:space="preserve"> = </w:t>
-      </w:r>
-      <w:proofErr w:type="gramStart"/>
-      <w:r>
-        <w:rPr>
-          <w:bCs/>
-          <w:color w:val="000000"/>
-        </w:rPr>
-        <w:t>float(input(</w:t>
-      </w:r>
-      <w:proofErr w:type="gramEnd"/>
-      <w:r>
-        <w:rPr>
-          <w:bCs/>
-          <w:color w:val="000000"/>
-        </w:rPr>
-        <w:t>"Enter the annual interest rate (in decimal): "))</w:t>
-      </w:r>
-    </w:p>
-    <w:p>
-      <w:pPr>
-        <w:spacing w:after="0" w:line="240" w:lineRule="auto"/>
-        <w:rPr>
-          <w:bCs/>
-          <w:color w:val="000000"/>
-        </w:rPr>
-      </w:pPr>
-      <w:r>
-        <w:rPr>
-          <w:bCs/>
-          <w:color w:val="000000"/>
-        </w:rPr>
-        <w:t xml:space="preserve">years = </w:t>
-      </w:r>
-      <w:proofErr w:type="gramStart"/>
-      <w:r>
-        <w:rPr>
-          <w:bCs/>
-          <w:color w:val="000000"/>
-        </w:rPr>
-        <w:t>int(input(</w:t>
-      </w:r>
-      <w:proofErr w:type="gramEnd"/>
-      <w:r>
-        <w:rPr>
-          <w:bCs/>
-          <w:color w:val="000000"/>
-        </w:rPr>
-        <w:t>"Enter the number of years: "))</w:t>
-      </w:r>
-    </w:p>
-    <w:p>
-      <w:pPr>
-        <w:spacing w:after="0" w:line="240" w:lineRule="auto"/>
-        <w:rPr>
-          <w:bCs/>
-          <w:color w:val="000000"/>
-        </w:rPr>
-      </w:pPr>
-    </w:p>
-    <w:p>
-      <w:pPr>
-        <w:spacing w:after="0" w:line="240" w:lineRule="auto"/>
-        <w:rPr>
-          <w:bCs/>
-          <w:color w:val="000000"/>
-        </w:rPr>
-      </w:pPr>
-      <w:proofErr w:type="spellStart"/>
-      <w:r>
-        <w:rPr>
-          <w:bCs/>
-          <w:color w:val="000000"/>
-        </w:rPr>
-        <w:t>final_amount</w:t>
-      </w:r>
-      <w:proofErr w:type="spellEnd"/>
-      <w:r>
-        <w:rPr>
-          <w:bCs/>
-          <w:color w:val="000000"/>
-        </w:rPr>
-        <w:t xml:space="preserve"> = deposit * </w:t>
-      </w:r>
-      <w:proofErr w:type="spellStart"/>
-      <w:proofErr w:type="gramStart"/>
-      <w:r>
-        <w:rPr>
-          <w:bCs/>
-          <w:color w:val="000000"/>
-        </w:rPr>
-        <w:t>math.pow</w:t>
-      </w:r>
-      <w:proofErr w:type="spellEnd"/>
-      <w:r>
-        <w:rPr>
-          <w:bCs/>
-          <w:color w:val="000000"/>
-        </w:rPr>
-        <w:t>(</w:t>
-      </w:r>
-      <w:proofErr w:type="gramEnd"/>
-      <w:r>
-        <w:rPr>
-          <w:bCs/>
-          <w:color w:val="000000"/>
-        </w:rPr>
-        <w:t xml:space="preserve">(1+ </w:t>
-      </w:r>
-      <w:proofErr w:type="spellStart"/>
-      <w:r>
-        <w:rPr>
-          <w:bCs/>
-          <w:color w:val="000000"/>
-        </w:rPr>
-        <w:t>interest_rate</w:t>
-      </w:r>
-      <w:proofErr w:type="spellEnd"/>
-      <w:r>
-        <w:rPr>
-          <w:bCs/>
-          <w:color w:val="000000"/>
-        </w:rPr>
-        <w:t>), years)</w:t>
-      </w:r>
-    </w:p>
-    <w:p>
-      <w:pPr>
-        <w:spacing w:after="0" w:line="240" w:lineRule="auto"/>
-        <w:rPr>
-          <w:bCs/>
-          <w:color w:val="000000"/>
-        </w:rPr>
-      </w:pPr>
-      <w:proofErr w:type="gramStart"/>
-      <w:r>
-        <w:rPr>
-          <w:bCs/>
-          <w:color w:val="000000"/>
-        </w:rPr>
-        <w:t>print(</w:t>
-      </w:r>
-      <w:proofErr w:type="spellStart"/>
-      <w:proofErr w:type="gramEnd"/>
-      <w:r>
-        <w:rPr>
-          <w:bCs/>
-          <w:color w:val="000000"/>
-        </w:rPr>
-        <w:t>f"The</w:t>
-      </w:r>
-      <w:proofErr w:type="spellEnd"/>
-      <w:r>
-        <w:rPr>
-          <w:bCs/>
-          <w:color w:val="000000"/>
-        </w:rPr>
-        <w:t xml:space="preserve"> final amount of the investment after {years} years is: {final_amount:.2f}")</w:t>
+        <w:t>deposit = float(input("Enter the initial deposit: "))</w:t>
+      </w:r>
+    </w:p>
+    <w:p>
+      <w:pPr>
+        <w:spacing w:after="0" w:line="240" w:lineRule="auto"/>
+        <w:rPr>
+          <w:bCs/>
+          <w:color w:val="000000"/>
+        </w:rPr>
+      </w:pPr>
+      <w:r>
+        <w:rPr>
+          <w:bCs/>
+          <w:color w:val="000000"/>
+        </w:rPr>
+        <w:t>interest_rate = float(input("Enter the annual interest rate (in decimal): "))</w:t>
+      </w:r>
+    </w:p>
+    <w:p>
+      <w:pPr>
+        <w:spacing w:after="0" w:line="240" w:lineRule="auto"/>
+        <w:rPr>
+          <w:bCs/>
+          <w:color w:val="000000"/>
+        </w:rPr>
+      </w:pPr>
+      <w:r>
+        <w:rPr>
+          <w:bCs/>
+          <w:color w:val="000000"/>
+        </w:rPr>
+        <w:t>years = int(input("Enter the number of years: "))</w:t>
+      </w:r>
+    </w:p>
+    <w:p>
+      <w:pPr>
+        <w:spacing w:after="0" w:line="240" w:lineRule="auto"/>
+        <w:rPr>
+          <w:bCs/>
+          <w:color w:val="000000"/>
+        </w:rPr>
+      </w:pPr>
+    </w:p>
+    <w:p>
+      <w:pPr>
+        <w:spacing w:after="0" w:line="240" w:lineRule="auto"/>
+        <w:rPr>
+          <w:bCs/>
+          <w:color w:val="000000"/>
+        </w:rPr>
+      </w:pPr>
+      <w:r>
+        <w:rPr>
+          <w:bCs/>
+          <w:color w:val="000000"/>
+        </w:rPr>
+        <w:t>final_amount = deposit * math.pow((1+ interest_rate), years)</w:t>
+      </w:r>
+    </w:p>
+    <w:p>
+      <w:pPr>
+        <w:spacing w:after="0" w:line="240" w:lineRule="auto"/>
+        <w:rPr>
+          <w:bCs/>
+          <w:color w:val="000000"/>
+        </w:rPr>
+      </w:pPr>
+      <w:r>
+        <w:rPr>
+          <w:bCs/>
+          <w:color w:val="000000"/>
+        </w:rPr>
+        <w:t>print(f"The final amount of the investment after {years} years is: {final_amount:.2f}")</w:t>
       </w:r>
     </w:p>
     <w:p>
@@ -2254,15 +2064,7 @@
         <w:t xml:space="preserve"> </w:t>
       </w:r>
       <w:r>
-        <w:t xml:space="preserve">x = (-b ± </w:t>
-      </w:r>
-      <w:proofErr w:type="gramStart"/>
-      <w:r>
-        <w:t>√(</w:t>
-      </w:r>
-      <w:proofErr w:type="gramEnd"/>
-      <w:r>
-        <w:t>b² - 4ac)) / 2a</w:t>
+        <w:t>x = (-b ± √(b² - 4ac)) / 2a</w:t>
       </w:r>
       <w:bookmarkEnd w:id="3"/>
     </w:p>
@@ -2393,125 +2195,55 @@
           <w:bCs/>
           <w:color w:val="000000"/>
         </w:rPr>
-        <w:t xml:space="preserve">    root1 = (-b + </w:t>
-      </w:r>
-      <w:proofErr w:type="spellStart"/>
-      <w:proofErr w:type="gramStart"/>
-      <w:r>
-        <w:rPr>
-          <w:bCs/>
-          <w:color w:val="000000"/>
-        </w:rPr>
-        <w:t>math.sqrt</w:t>
-      </w:r>
-      <w:proofErr w:type="spellEnd"/>
-      <w:proofErr w:type="gramEnd"/>
-      <w:r>
-        <w:rPr>
-          <w:bCs/>
-          <w:color w:val="000000"/>
-        </w:rPr>
-        <w:t>(discriminant)) / (2*a)</w:t>
-      </w:r>
-    </w:p>
-    <w:p>
-      <w:pPr>
-        <w:spacing w:after="0" w:line="240" w:lineRule="auto"/>
-        <w:rPr>
-          <w:bCs/>
-          <w:color w:val="000000"/>
-        </w:rPr>
-      </w:pPr>
-      <w:r>
-        <w:rPr>
-          <w:bCs/>
-          <w:color w:val="000000"/>
-        </w:rPr>
-        <w:t xml:space="preserve">    root2 = (-b - </w:t>
-      </w:r>
-      <w:proofErr w:type="spellStart"/>
-      <w:proofErr w:type="gramStart"/>
-      <w:r>
-        <w:rPr>
-          <w:bCs/>
-          <w:color w:val="000000"/>
-        </w:rPr>
-        <w:t>math.sqrt</w:t>
-      </w:r>
-      <w:proofErr w:type="spellEnd"/>
-      <w:proofErr w:type="gramEnd"/>
-      <w:r>
-        <w:rPr>
-          <w:bCs/>
-          <w:color w:val="000000"/>
-        </w:rPr>
-        <w:t>(discriminant)) / (2*a)</w:t>
-      </w:r>
-    </w:p>
-    <w:p>
-      <w:pPr>
-        <w:spacing w:after="0" w:line="240" w:lineRule="auto"/>
-        <w:rPr>
-          <w:bCs/>
-          <w:color w:val="000000"/>
-        </w:rPr>
-      </w:pPr>
-      <w:r>
-        <w:rPr>
-          <w:bCs/>
-          <w:color w:val="000000"/>
-        </w:rPr>
-        <w:t xml:space="preserve">    </w:t>
-      </w:r>
-      <w:proofErr w:type="gramStart"/>
-      <w:r>
-        <w:rPr>
-          <w:bCs/>
-          <w:color w:val="000000"/>
-        </w:rPr>
-        <w:t>print(</w:t>
-      </w:r>
-      <w:proofErr w:type="spellStart"/>
-      <w:proofErr w:type="gramEnd"/>
-      <w:r>
-        <w:rPr>
-          <w:bCs/>
-          <w:color w:val="000000"/>
-        </w:rPr>
-        <w:t>f"The</w:t>
-      </w:r>
-      <w:proofErr w:type="spellEnd"/>
-      <w:r>
-        <w:rPr>
-          <w:bCs/>
-          <w:color w:val="000000"/>
-        </w:rPr>
-        <w:t xml:space="preserve"> roots are real and different: {root1} and {root2}")</w:t>
-      </w:r>
-    </w:p>
-    <w:p>
-      <w:pPr>
-        <w:spacing w:after="0" w:line="240" w:lineRule="auto"/>
-        <w:rPr>
-          <w:bCs/>
-          <w:color w:val="000000"/>
-        </w:rPr>
-      </w:pPr>
-      <w:proofErr w:type="spellStart"/>
-      <w:r>
-        <w:rPr>
-          <w:bCs/>
-          <w:color w:val="000000"/>
-        </w:rPr>
-        <w:t>elif</w:t>
-      </w:r>
-      <w:proofErr w:type="spellEnd"/>
-      <w:r>
-        <w:rPr>
-          <w:bCs/>
-          <w:color w:val="000000"/>
-        </w:rPr>
-        <w:t xml:space="preserve"> discriminant == 0:</w:t>
+        <w:t>    root1 = (-b + math.sqrt(discriminant)) / (2*a)</w:t>
+      </w:r>
+    </w:p>
+    <w:p>
+      <w:pPr>
+        <w:spacing w:after="0" w:line="240" w:lineRule="auto"/>
+        <w:rPr>
+          <w:bCs/>
+          <w:color w:val="000000"/>
+        </w:rPr>
+      </w:pPr>
+      <w:r>
+        <w:rPr>
+          <w:bCs/>
+          <w:color w:val="000000"/>
+        </w:rPr>
+        <w:t>    root2 = (-b - math.sqrt(discriminant)) / (2*a)</w:t>
+      </w:r>
+    </w:p>
+    <w:p>
+      <w:pPr>
+        <w:spacing w:after="0" w:line="240" w:lineRule="auto"/>
+        <w:rPr>
+          <w:bCs/>
+          <w:color w:val="000000"/>
+        </w:rPr>
+      </w:pPr>
+      <w:r>
+        <w:rPr>
+          <w:bCs/>
+          <w:color w:val="000000"/>
+        </w:rPr>
+        <w:t>    print(f"The roots are real and different: {root1} and {root2}")</w:t>
+      </w:r>
+    </w:p>
+    <w:p>
+      <w:pPr>
+        <w:spacing w:after="0" w:line="240" w:lineRule="auto"/>
+        <w:rPr>
+          <w:bCs/>
+          <w:color w:val="000000"/>
+        </w:rPr>
+      </w:pPr>
+      <w:r>
+        <w:rPr>
+          <w:bCs/>
+          <w:color w:val="000000"/>
+        </w:rPr>
+        <w:t>elif discriminant == 0:</w:t>
       </w:r>
     </w:p>
     <w:p>
@@ -2543,32 +2275,7 @@
           <w:bCs/>
           <w:color w:val="000000"/>
         </w:rPr>
-        <w:t xml:space="preserve">    </w:t>
-      </w:r>
-      <w:proofErr w:type="gramStart"/>
-      <w:r>
-        <w:rPr>
-          <w:bCs/>
-          <w:color w:val="000000"/>
-        </w:rPr>
-        <w:t>print(</w:t>
-      </w:r>
-      <w:proofErr w:type="spellStart"/>
-      <w:proofErr w:type="gramEnd"/>
-      <w:r>
-        <w:rPr>
-          <w:bCs/>
-          <w:color w:val="000000"/>
-        </w:rPr>
-        <w:t>f"The</w:t>
-      </w:r>
-      <w:proofErr w:type="spellEnd"/>
-      <w:r>
-        <w:rPr>
-          <w:bCs/>
-          <w:color w:val="000000"/>
-        </w:rPr>
-        <w:t xml:space="preserve"> roots are real and the same: {root}")</w:t>
+        <w:t>    print(f"The roots are real and the same: {root}")</w:t>
       </w:r>
     </w:p>
     <w:p>
@@ -2600,228 +2307,39 @@
           <w:bCs/>
           <w:color w:val="000000"/>
         </w:rPr>
-        <w:t xml:space="preserve">    </w:t>
-      </w:r>
-      <w:proofErr w:type="spellStart"/>
-      <w:r>
-        <w:rPr>
-          <w:bCs/>
-          <w:color w:val="000000"/>
-        </w:rPr>
-        <w:t>real_part</w:t>
-      </w:r>
-      <w:proofErr w:type="spellEnd"/>
-      <w:r>
-        <w:rPr>
-          <w:bCs/>
-          <w:color w:val="000000"/>
-        </w:rPr>
-        <w:t xml:space="preserve"> = -b / (2*a)</w:t>
-      </w:r>
-    </w:p>
-    <w:p>
-      <w:pPr>
-        <w:spacing w:after="0" w:line="240" w:lineRule="auto"/>
-        <w:rPr>
-          <w:bCs/>
-          <w:color w:val="000000"/>
-        </w:rPr>
-      </w:pPr>
-      <w:r>
-        <w:rPr>
-          <w:bCs/>
-          <w:color w:val="000000"/>
-        </w:rPr>
-        <w:t xml:space="preserve">    </w:t>
-      </w:r>
-      <w:proofErr w:type="spellStart"/>
-      <w:r>
-        <w:rPr>
-          <w:bCs/>
-          <w:color w:val="000000"/>
-        </w:rPr>
-        <w:t>imaginary_part</w:t>
-      </w:r>
-      <w:proofErr w:type="spellEnd"/>
-      <w:r>
-        <w:rPr>
-          <w:bCs/>
-          <w:color w:val="000000"/>
-        </w:rPr>
-        <w:t xml:space="preserve"> = </w:t>
-      </w:r>
-      <w:proofErr w:type="spellStart"/>
-      <w:proofErr w:type="gramStart"/>
-      <w:r>
-        <w:rPr>
-          <w:bCs/>
-          <w:color w:val="000000"/>
-        </w:rPr>
-        <w:t>math.sqrt</w:t>
-      </w:r>
-      <w:proofErr w:type="spellEnd"/>
-      <w:proofErr w:type="gramEnd"/>
-      <w:r>
-        <w:rPr>
-          <w:bCs/>
-          <w:color w:val="000000"/>
-        </w:rPr>
-        <w:t>(-discriminant) / (2*a)</w:t>
-      </w:r>
-    </w:p>
-    <w:p>
-      <w:pPr>
-        <w:spacing w:after="0" w:line="240" w:lineRule="auto"/>
-        <w:rPr>
-          <w:bCs/>
-          <w:color w:val="000000"/>
-        </w:rPr>
-      </w:pPr>
-      <w:r>
-        <w:rPr>
-          <w:bCs/>
-          <w:color w:val="000000"/>
-        </w:rPr>
-        <w:t xml:space="preserve">    </w:t>
-      </w:r>
-      <w:proofErr w:type="gramStart"/>
-      <w:r>
-        <w:rPr>
-          <w:bCs/>
-          <w:color w:val="000000"/>
-        </w:rPr>
-        <w:t>print(</w:t>
-      </w:r>
-      <w:proofErr w:type="spellStart"/>
-      <w:proofErr w:type="gramEnd"/>
-      <w:r>
-        <w:rPr>
-          <w:bCs/>
-          <w:color w:val="000000"/>
-        </w:rPr>
-        <w:t>f"The</w:t>
-      </w:r>
-      <w:proofErr w:type="spellEnd"/>
-      <w:r>
-        <w:rPr>
-          <w:bCs/>
-          <w:color w:val="000000"/>
-        </w:rPr>
-        <w:t xml:space="preserve"> roots are complex: {</w:t>
-      </w:r>
-      <w:proofErr w:type="spellStart"/>
-      <w:r>
-        <w:rPr>
-          <w:bCs/>
-          <w:color w:val="000000"/>
-        </w:rPr>
-        <w:t>real_part</w:t>
-      </w:r>
-      <w:proofErr w:type="spellEnd"/>
-      <w:r>
-        <w:rPr>
-          <w:bCs/>
-          <w:color w:val="000000"/>
-        </w:rPr>
-        <w:t>} + {</w:t>
-      </w:r>
-      <w:proofErr w:type="spellStart"/>
-      <w:r>
-        <w:rPr>
-          <w:bCs/>
-          <w:color w:val="000000"/>
-        </w:rPr>
-        <w:t>imaginary_</w:t>
-      </w:r>
-      <w:proofErr w:type="gramStart"/>
-      <w:r>
-        <w:rPr>
-          <w:bCs/>
-          <w:color w:val="000000"/>
-        </w:rPr>
-        <w:t>part</w:t>
-      </w:r>
-      <w:proofErr w:type="spellEnd"/>
-      <w:r>
-        <w:rPr>
-          <w:bCs/>
-          <w:color w:val="000000"/>
-        </w:rPr>
-        <w:t>}</w:t>
-      </w:r>
-      <w:proofErr w:type="spellStart"/>
-      <w:r>
-        <w:rPr>
-          <w:bCs/>
-          <w:color w:val="000000"/>
-        </w:rPr>
-        <w:t>i</w:t>
-      </w:r>
-      <w:proofErr w:type="spellEnd"/>
-      <w:proofErr w:type="gramEnd"/>
-      <w:r>
-        <w:rPr>
-          <w:bCs/>
-          <w:color w:val="000000"/>
-        </w:rPr>
-        <w:t xml:space="preserve"> and {</w:t>
-      </w:r>
-      <w:proofErr w:type="spellStart"/>
-      <w:r>
-        <w:rPr>
-          <w:bCs/>
-          <w:color w:val="000000"/>
-        </w:rPr>
-        <w:t>real_part</w:t>
-      </w:r>
-      <w:proofErr w:type="spellEnd"/>
-      <w:r>
-        <w:rPr>
-          <w:bCs/>
-          <w:color w:val="000000"/>
-        </w:rPr>
-        <w:t>} - {</w:t>
-      </w:r>
-      <w:proofErr w:type="spellStart"/>
-      <w:r>
-        <w:rPr>
-          <w:bCs/>
-          <w:color w:val="000000"/>
-        </w:rPr>
-        <w:t>imaginary_</w:t>
-      </w:r>
-      <w:proofErr w:type="gramStart"/>
-      <w:r>
-        <w:rPr>
-          <w:bCs/>
-          <w:color w:val="000000"/>
-        </w:rPr>
-        <w:t>part</w:t>
-      </w:r>
-      <w:proofErr w:type="spellEnd"/>
-      <w:r>
-        <w:rPr>
-          <w:bCs/>
-          <w:color w:val="000000"/>
-        </w:rPr>
-        <w:t>}</w:t>
-      </w:r>
-      <w:proofErr w:type="spellStart"/>
-      <w:r>
-        <w:rPr>
-          <w:bCs/>
-          <w:color w:val="000000"/>
-        </w:rPr>
-        <w:t>i</w:t>
-      </w:r>
-      <w:proofErr w:type="spellEnd"/>
-      <w:proofErr w:type="gramEnd"/>
-      <w:r>
-        <w:rPr>
-          <w:bCs/>
-          <w:color w:val="000000"/>
-        </w:rPr>
-        <w:t>")</w:t>
+        <w:t>    real_part = -b / (2*a)</w:t>
+      </w:r>
+    </w:p>
+    <w:p>
+      <w:pPr>
+        <w:spacing w:after="0" w:line="240" w:lineRule="auto"/>
+        <w:rPr>
+          <w:bCs/>
+          <w:color w:val="000000"/>
+        </w:rPr>
+      </w:pPr>
+      <w:r>
+        <w:rPr>
+          <w:bCs/>
+          <w:color w:val="000000"/>
+        </w:rPr>
+        <w:t>    imaginary_part = math.sqrt(-discriminant) / (2*a)</w:t>
+      </w:r>
+    </w:p>
+    <w:p>
+      <w:pPr>
+        <w:spacing w:after="0" w:line="240" w:lineRule="auto"/>
+        <w:rPr>
+          <w:bCs/>
+          <w:color w:val="000000"/>
+        </w:rPr>
+      </w:pPr>
+      <w:r>
+        <w:rPr>
+          <w:bCs/>
+          <w:color w:val="000000"/>
+        </w:rPr>
+        <w:t>    print(f"The roots are complex: {real_part} + {imaginary_part}i and {real_part} - {imaginary_part}i")</w:t>
       </w:r>
     </w:p>
     <w:p>
@@ -2989,23 +2507,7 @@
           <w:bCs/>
           <w:color w:val="000000"/>
         </w:rPr>
-        <w:t xml:space="preserve">gender = </w:t>
-      </w:r>
-      <w:proofErr w:type="gramStart"/>
-      <w:r>
-        <w:rPr>
-          <w:bCs/>
-          <w:color w:val="000000"/>
-        </w:rPr>
-        <w:t>input(</w:t>
-      </w:r>
-      <w:proofErr w:type="gramEnd"/>
-      <w:r>
-        <w:rPr>
-          <w:bCs/>
-          <w:color w:val="000000"/>
-        </w:rPr>
-        <w:t>"Enter your gender: ")</w:t>
+        <w:t>gender = input("Enter your gender: ")</w:t>
       </w:r>
     </w:p>
     <w:p>
@@ -3046,80 +2548,39 @@
           <w:bCs/>
           <w:color w:val="000000"/>
         </w:rPr>
-        <w:t xml:space="preserve">    </w:t>
-      </w:r>
-      <w:proofErr w:type="gramStart"/>
-      <w:r>
-        <w:rPr>
-          <w:bCs/>
-          <w:color w:val="000000"/>
-        </w:rPr>
-        <w:t>print(</w:t>
-      </w:r>
-      <w:proofErr w:type="gramEnd"/>
-      <w:r>
-        <w:rPr>
-          <w:bCs/>
-          <w:color w:val="000000"/>
-        </w:rPr>
-        <w:t>"Good Morning Sir.")</w:t>
-      </w:r>
-    </w:p>
-    <w:p>
-      <w:pPr>
-        <w:spacing w:after="0" w:line="240" w:lineRule="auto"/>
-        <w:rPr>
-          <w:bCs/>
-          <w:color w:val="000000"/>
-        </w:rPr>
-      </w:pPr>
-      <w:proofErr w:type="spellStart"/>
-      <w:r>
-        <w:rPr>
-          <w:bCs/>
-          <w:color w:val="000000"/>
-        </w:rPr>
-        <w:t>elif</w:t>
-      </w:r>
-      <w:proofErr w:type="spellEnd"/>
-      <w:r>
-        <w:rPr>
-          <w:bCs/>
-          <w:color w:val="000000"/>
-        </w:rPr>
-        <w:t xml:space="preserve"> gender == "female":</w:t>
-      </w:r>
-    </w:p>
-    <w:p>
-      <w:pPr>
-        <w:spacing w:after="0" w:line="240" w:lineRule="auto"/>
-        <w:rPr>
-          <w:bCs/>
-          <w:color w:val="000000"/>
-        </w:rPr>
-      </w:pPr>
-      <w:r>
-        <w:rPr>
-          <w:bCs/>
-          <w:color w:val="000000"/>
-        </w:rPr>
-        <w:t xml:space="preserve">    </w:t>
-      </w:r>
-      <w:proofErr w:type="gramStart"/>
-      <w:r>
-        <w:rPr>
-          <w:bCs/>
-          <w:color w:val="000000"/>
-        </w:rPr>
-        <w:t>print(</w:t>
-      </w:r>
-      <w:proofErr w:type="gramEnd"/>
-      <w:r>
-        <w:rPr>
-          <w:bCs/>
-          <w:color w:val="000000"/>
-        </w:rPr>
-        <w:t>"Good Morning Ma’am.")</w:t>
+        <w:t>    print("Good Morning Sir.")</w:t>
+      </w:r>
+    </w:p>
+    <w:p>
+      <w:pPr>
+        <w:spacing w:after="0" w:line="240" w:lineRule="auto"/>
+        <w:rPr>
+          <w:bCs/>
+          <w:color w:val="000000"/>
+        </w:rPr>
+      </w:pPr>
+      <w:r>
+        <w:rPr>
+          <w:bCs/>
+          <w:color w:val="000000"/>
+        </w:rPr>
+        <w:t>elif gender == "female":</w:t>
+      </w:r>
+    </w:p>
+    <w:p>
+      <w:pPr>
+        <w:spacing w:after="0" w:line="240" w:lineRule="auto"/>
+        <w:rPr>
+          <w:bCs/>
+          <w:color w:val="000000"/>
+        </w:rPr>
+      </w:pPr>
+      <w:r>
+        <w:rPr>
+          <w:bCs/>
+          <w:color w:val="000000"/>
+        </w:rPr>
+        <w:t>    print("Good Morning Ma’am.")</w:t>
       </w:r>
     </w:p>
     <w:p>
@@ -3151,23 +2612,7 @@
           <w:bCs/>
           <w:color w:val="000000"/>
         </w:rPr>
-        <w:t xml:space="preserve">    </w:t>
-      </w:r>
-      <w:proofErr w:type="gramStart"/>
-      <w:r>
-        <w:rPr>
-          <w:bCs/>
-          <w:color w:val="000000"/>
-        </w:rPr>
-        <w:t>print(</w:t>
-      </w:r>
-      <w:proofErr w:type="gramEnd"/>
-      <w:r>
-        <w:rPr>
-          <w:bCs/>
-          <w:color w:val="000000"/>
-        </w:rPr>
-        <w:t>"Invalid input. Please enter only male or female.")</w:t>
+        <w:t>    print("Invalid input. Please enter only male or female.")</w:t>
       </w:r>
     </w:p>
     <w:p>
@@ -3452,263 +2897,108 @@
           <w:color w:val="000000"/>
         </w:rPr>
       </w:pPr>
-      <w:proofErr w:type="spellStart"/>
-      <w:r>
-        <w:rPr>
-          <w:bCs/>
-          <w:color w:val="000000"/>
-        </w:rPr>
-        <w:t>signal_color</w:t>
-      </w:r>
-      <w:proofErr w:type="spellEnd"/>
-      <w:r>
-        <w:rPr>
-          <w:bCs/>
-          <w:color w:val="000000"/>
-        </w:rPr>
-        <w:t xml:space="preserve"> = </w:t>
-      </w:r>
-      <w:proofErr w:type="gramStart"/>
-      <w:r>
-        <w:rPr>
-          <w:bCs/>
-          <w:color w:val="000000"/>
-        </w:rPr>
-        <w:t>input(</w:t>
-      </w:r>
-      <w:proofErr w:type="gramEnd"/>
-      <w:r>
-        <w:rPr>
-          <w:bCs/>
-          <w:color w:val="000000"/>
-        </w:rPr>
-        <w:t>"Enter the color of the traffic signal (RED, YELLOW, GREEN): "</w:t>
-      </w:r>
-      <w:proofErr w:type="gramStart"/>
-      <w:r>
-        <w:rPr>
-          <w:bCs/>
-          <w:color w:val="000000"/>
-        </w:rPr>
-        <w:t>).upper</w:t>
-      </w:r>
-      <w:proofErr w:type="gramEnd"/>
-      <w:r>
-        <w:rPr>
-          <w:bCs/>
-          <w:color w:val="000000"/>
-        </w:rPr>
-        <w:t>()</w:t>
-      </w:r>
-    </w:p>
-    <w:p>
-      <w:pPr>
-        <w:spacing w:after="0" w:line="240" w:lineRule="auto"/>
-        <w:rPr>
-          <w:bCs/>
-          <w:color w:val="000000"/>
-        </w:rPr>
-      </w:pPr>
-      <w:r>
-        <w:rPr>
-          <w:bCs/>
-          <w:color w:val="000000"/>
-        </w:rPr>
-        <w:t xml:space="preserve">if </w:t>
-      </w:r>
-      <w:proofErr w:type="spellStart"/>
-      <w:r>
-        <w:rPr>
-          <w:bCs/>
-          <w:color w:val="000000"/>
-        </w:rPr>
-        <w:t>signal_color</w:t>
-      </w:r>
-      <w:proofErr w:type="spellEnd"/>
-      <w:r>
-        <w:rPr>
-          <w:bCs/>
-          <w:color w:val="000000"/>
-        </w:rPr>
-        <w:t xml:space="preserve"> == "RED":</w:t>
-      </w:r>
-    </w:p>
-    <w:p>
-      <w:pPr>
-        <w:spacing w:after="0" w:line="240" w:lineRule="auto"/>
-        <w:rPr>
-          <w:bCs/>
-          <w:color w:val="000000"/>
-        </w:rPr>
-      </w:pPr>
-      <w:r>
-        <w:rPr>
-          <w:bCs/>
-          <w:color w:val="000000"/>
-        </w:rPr>
-        <w:t xml:space="preserve">    </w:t>
-      </w:r>
-      <w:proofErr w:type="gramStart"/>
-      <w:r>
-        <w:rPr>
-          <w:bCs/>
-          <w:color w:val="000000"/>
-        </w:rPr>
-        <w:t>print(</w:t>
-      </w:r>
-      <w:proofErr w:type="gramEnd"/>
-      <w:r>
-        <w:rPr>
-          <w:bCs/>
-          <w:color w:val="000000"/>
-        </w:rPr>
-        <w:t>"Vehicle must stop")</w:t>
-      </w:r>
-    </w:p>
-    <w:p>
-      <w:pPr>
-        <w:spacing w:after="0" w:line="240" w:lineRule="auto"/>
-        <w:rPr>
-          <w:bCs/>
-          <w:color w:val="000000"/>
-        </w:rPr>
-      </w:pPr>
-      <w:proofErr w:type="spellStart"/>
-      <w:r>
-        <w:rPr>
-          <w:bCs/>
-          <w:color w:val="000000"/>
-        </w:rPr>
-        <w:t>elif</w:t>
-      </w:r>
-      <w:proofErr w:type="spellEnd"/>
-      <w:r>
-        <w:rPr>
-          <w:bCs/>
-          <w:color w:val="000000"/>
-        </w:rPr>
-        <w:t xml:space="preserve"> </w:t>
-      </w:r>
-      <w:proofErr w:type="spellStart"/>
-      <w:r>
-        <w:rPr>
-          <w:bCs/>
-          <w:color w:val="000000"/>
-        </w:rPr>
-        <w:t>signal_color</w:t>
-      </w:r>
-      <w:proofErr w:type="spellEnd"/>
-      <w:r>
-        <w:rPr>
-          <w:bCs/>
-          <w:color w:val="000000"/>
-        </w:rPr>
-        <w:t xml:space="preserve"> == "YELLOW":</w:t>
-      </w:r>
-    </w:p>
-    <w:p>
-      <w:pPr>
-        <w:spacing w:after="0" w:line="240" w:lineRule="auto"/>
-        <w:rPr>
-          <w:bCs/>
-          <w:color w:val="000000"/>
-        </w:rPr>
-      </w:pPr>
-      <w:r>
-        <w:rPr>
-          <w:bCs/>
-          <w:color w:val="000000"/>
-        </w:rPr>
-        <w:t xml:space="preserve">    </w:t>
-      </w:r>
-      <w:proofErr w:type="gramStart"/>
-      <w:r>
-        <w:rPr>
-          <w:bCs/>
-          <w:color w:val="000000"/>
-        </w:rPr>
-        <w:t>print(</w:t>
-      </w:r>
-      <w:proofErr w:type="gramEnd"/>
-      <w:r>
-        <w:rPr>
-          <w:bCs/>
-          <w:color w:val="000000"/>
-        </w:rPr>
-        <w:t>"Vehicles should get ready to move")</w:t>
-      </w:r>
-    </w:p>
-    <w:p>
-      <w:pPr>
-        <w:spacing w:after="0" w:line="240" w:lineRule="auto"/>
-        <w:rPr>
-          <w:bCs/>
-          <w:color w:val="000000"/>
-        </w:rPr>
-      </w:pPr>
-      <w:proofErr w:type="spellStart"/>
-      <w:r>
-        <w:rPr>
-          <w:bCs/>
-          <w:color w:val="000000"/>
-        </w:rPr>
-        <w:t>elif</w:t>
-      </w:r>
-      <w:proofErr w:type="spellEnd"/>
-      <w:r>
-        <w:rPr>
-          <w:bCs/>
-          <w:color w:val="000000"/>
-        </w:rPr>
-        <w:t xml:space="preserve"> </w:t>
-      </w:r>
-      <w:proofErr w:type="spellStart"/>
-      <w:r>
-        <w:rPr>
-          <w:bCs/>
-          <w:color w:val="000000"/>
-        </w:rPr>
-        <w:t>signal_color</w:t>
-      </w:r>
-      <w:proofErr w:type="spellEnd"/>
-      <w:r>
-        <w:rPr>
-          <w:bCs/>
-          <w:color w:val="000000"/>
-        </w:rPr>
-        <w:t xml:space="preserve"> == "GREEN":</w:t>
-      </w:r>
-    </w:p>
-    <w:p>
-      <w:pPr>
-        <w:spacing w:after="0" w:line="240" w:lineRule="auto"/>
-        <w:rPr>
-          <w:bCs/>
-          <w:color w:val="000000"/>
-        </w:rPr>
-      </w:pPr>
-      <w:r>
-        <w:rPr>
-          <w:bCs/>
-          <w:color w:val="000000"/>
-        </w:rPr>
-        <w:t xml:space="preserve">    </w:t>
-      </w:r>
-      <w:proofErr w:type="gramStart"/>
-      <w:r>
-        <w:rPr>
-          <w:bCs/>
-          <w:color w:val="000000"/>
-        </w:rPr>
-        <w:t>print(</w:t>
-      </w:r>
-      <w:proofErr w:type="gramEnd"/>
-      <w:r>
-        <w:rPr>
-          <w:bCs/>
-          <w:color w:val="000000"/>
-        </w:rPr>
-        <w:t>"Vehicles can move now")</w:t>
+      <w:r>
+        <w:rPr>
+          <w:bCs/>
+          <w:color w:val="000000"/>
+        </w:rPr>
+        <w:t>signal_color = input("Enter the color of the traffic signal (RED, YELLOW, GREEN): ").upper()</w:t>
+      </w:r>
+    </w:p>
+    <w:p>
+      <w:pPr>
+        <w:spacing w:after="0" w:line="240" w:lineRule="auto"/>
+        <w:rPr>
+          <w:bCs/>
+          <w:color w:val="000000"/>
+        </w:rPr>
+      </w:pPr>
+      <w:r>
+        <w:rPr>
+          <w:bCs/>
+          <w:color w:val="000000"/>
+        </w:rPr>
+        <w:t>if signal_color == "RED":</w:t>
+      </w:r>
+    </w:p>
+    <w:p>
+      <w:pPr>
+        <w:spacing w:after="0" w:line="240" w:lineRule="auto"/>
+        <w:rPr>
+          <w:bCs/>
+          <w:color w:val="000000"/>
+        </w:rPr>
+      </w:pPr>
+      <w:r>
+        <w:rPr>
+          <w:bCs/>
+          <w:color w:val="000000"/>
+        </w:rPr>
+        <w:t>    print("Vehicle must stop")</w:t>
+      </w:r>
+    </w:p>
+    <w:p>
+      <w:pPr>
+        <w:spacing w:after="0" w:line="240" w:lineRule="auto"/>
+        <w:rPr>
+          <w:bCs/>
+          <w:color w:val="000000"/>
+        </w:rPr>
+      </w:pPr>
+      <w:r>
+        <w:rPr>
+          <w:bCs/>
+          <w:color w:val="000000"/>
+        </w:rPr>
+        <w:t>elif signal_color == "YELLOW":</w:t>
+      </w:r>
+    </w:p>
+    <w:p>
+      <w:pPr>
+        <w:spacing w:after="0" w:line="240" w:lineRule="auto"/>
+        <w:rPr>
+          <w:bCs/>
+          <w:color w:val="000000"/>
+        </w:rPr>
+      </w:pPr>
+      <w:r>
+        <w:rPr>
+          <w:bCs/>
+          <w:color w:val="000000"/>
+        </w:rPr>
+        <w:t>    print("Vehicles should get ready to move")</w:t>
+      </w:r>
+    </w:p>
+    <w:p>
+      <w:pPr>
+        <w:spacing w:after="0" w:line="240" w:lineRule="auto"/>
+        <w:rPr>
+          <w:bCs/>
+          <w:color w:val="000000"/>
+        </w:rPr>
+      </w:pPr>
+      <w:r>
+        <w:rPr>
+          <w:bCs/>
+          <w:color w:val="000000"/>
+        </w:rPr>
+        <w:t>elif signal_color == "GREEN":</w:t>
+      </w:r>
+    </w:p>
+    <w:p>
+      <w:pPr>
+        <w:spacing w:after="0" w:line="240" w:lineRule="auto"/>
+        <w:rPr>
+          <w:bCs/>
+          <w:color w:val="000000"/>
+        </w:rPr>
+      </w:pPr>
+      <w:r>
+        <w:rPr>
+          <w:bCs/>
+          <w:color w:val="000000"/>
+        </w:rPr>
+        <w:t>    print("Vehicles can move now")</w:t>
       </w:r>
     </w:p>
     <w:p>
@@ -3740,23 +3030,7 @@
           <w:bCs/>
           <w:color w:val="000000"/>
         </w:rPr>
-        <w:t xml:space="preserve">    </w:t>
-      </w:r>
-      <w:proofErr w:type="gramStart"/>
-      <w:r>
-        <w:rPr>
-          <w:bCs/>
-          <w:color w:val="000000"/>
-        </w:rPr>
-        <w:t>print(</w:t>
-      </w:r>
-      <w:proofErr w:type="gramEnd"/>
-      <w:r>
-        <w:rPr>
-          <w:bCs/>
-          <w:color w:val="000000"/>
-        </w:rPr>
-        <w:t>"Invalid input. Please enter RED, YELLOW, or GREEN.")</w:t>
+        <w:t>    print("Invalid input. Please enter RED, YELLOW, or GREEN.")</w:t>
       </w:r>
     </w:p>
     <w:p>
@@ -3985,28 +3259,7 @@
         <w:t xml:space="preserve">6. </w:t>
       </w:r>
       <w:r>
-        <w:t xml:space="preserve">Write a program that takes user input day name. If the day is Monday, Tuesday, Wednesday, Thursday or Friday, then show “It’s a week day”. If the day is </w:t>
-      </w:r>
-      <w:proofErr w:type="gramStart"/>
-      <w:r>
-        <w:t>Saturday</w:t>
-      </w:r>
-      <w:proofErr w:type="gramEnd"/>
-      <w:r>
-        <w:t xml:space="preserve"> then show “It’s weekend”. If the day </w:t>
-      </w:r>
-      <w:proofErr w:type="gramStart"/>
-      <w:r>
-        <w:t>is  </w:t>
-      </w:r>
-      <w:proofErr w:type="spellStart"/>
-      <w:r>
-        <w:t>sunday</w:t>
-      </w:r>
-      <w:proofErr w:type="spellEnd"/>
-      <w:proofErr w:type="gramEnd"/>
-      <w:r>
-        <w:t xml:space="preserve"> then show “Yay! It’s a holiday”.</w:t>
+        <w:t>Write a program that takes user input day name. If the day is Monday, Tuesday, Wednesday, Thursday or Friday, then show “It’s a week day”. If the day is Saturday then show “It’s weekend”. If the day is  sunday then show “Yay! It’s a holiday”.</w:t>
       </w:r>
       <w:bookmarkEnd w:id="6"/>
     </w:p>
@@ -4032,39 +3285,7 @@
           <w:bCs/>
           <w:color w:val="000000"/>
         </w:rPr>
-        <w:t xml:space="preserve">day = </w:t>
-      </w:r>
-      <w:proofErr w:type="gramStart"/>
-      <w:r>
-        <w:rPr>
-          <w:bCs/>
-          <w:color w:val="000000"/>
-        </w:rPr>
-        <w:t>input(</w:t>
-      </w:r>
-      <w:proofErr w:type="gramEnd"/>
-      <w:r>
-        <w:rPr>
-          <w:bCs/>
-          <w:color w:val="000000"/>
-        </w:rPr>
-        <w:t>"Enter the day name: "</w:t>
-      </w:r>
-      <w:proofErr w:type="gramStart"/>
-      <w:r>
-        <w:rPr>
-          <w:bCs/>
-          <w:color w:val="000000"/>
-        </w:rPr>
-        <w:t>).upper</w:t>
-      </w:r>
-      <w:proofErr w:type="gramEnd"/>
-      <w:r>
-        <w:rPr>
-          <w:bCs/>
-          <w:color w:val="000000"/>
-        </w:rPr>
-        <w:t>()</w:t>
+        <w:t>day = input("Enter the day name: ").upper()</w:t>
       </w:r>
     </w:p>
     <w:p>
@@ -4112,137 +3333,71 @@
           <w:bCs/>
           <w:color w:val="000000"/>
         </w:rPr>
-        <w:t xml:space="preserve">    </w:t>
-      </w:r>
-      <w:proofErr w:type="gramStart"/>
-      <w:r>
-        <w:rPr>
-          <w:bCs/>
-          <w:color w:val="000000"/>
-        </w:rPr>
-        <w:t>print(</w:t>
-      </w:r>
-      <w:proofErr w:type="gramEnd"/>
-      <w:r>
-        <w:rPr>
-          <w:bCs/>
-          <w:color w:val="000000"/>
-        </w:rPr>
-        <w:t>"It's a week day")</w:t>
-      </w:r>
-    </w:p>
-    <w:p>
-      <w:pPr>
-        <w:spacing w:after="0" w:line="240" w:lineRule="auto"/>
-        <w:rPr>
-          <w:bCs/>
-          <w:color w:val="000000"/>
-        </w:rPr>
-      </w:pPr>
-      <w:proofErr w:type="spellStart"/>
-      <w:r>
-        <w:rPr>
-          <w:bCs/>
-          <w:color w:val="000000"/>
-        </w:rPr>
-        <w:t>elif</w:t>
-      </w:r>
-      <w:proofErr w:type="spellEnd"/>
-      <w:r>
-        <w:rPr>
-          <w:bCs/>
-          <w:color w:val="000000"/>
-        </w:rPr>
-        <w:t xml:space="preserve"> day == "SATURDAY":</w:t>
-      </w:r>
-    </w:p>
-    <w:p>
-      <w:pPr>
-        <w:spacing w:after="0" w:line="240" w:lineRule="auto"/>
-        <w:rPr>
-          <w:bCs/>
-          <w:color w:val="000000"/>
-        </w:rPr>
-      </w:pPr>
-      <w:r>
-        <w:rPr>
-          <w:bCs/>
-          <w:color w:val="000000"/>
-        </w:rPr>
-        <w:t xml:space="preserve">    </w:t>
-      </w:r>
-      <w:proofErr w:type="gramStart"/>
-      <w:r>
-        <w:rPr>
-          <w:bCs/>
-          <w:color w:val="000000"/>
-        </w:rPr>
-        <w:t>print(</w:t>
-      </w:r>
-      <w:proofErr w:type="gramEnd"/>
-      <w:r>
-        <w:rPr>
-          <w:bCs/>
-          <w:color w:val="000000"/>
-        </w:rPr>
-        <w:t>"It's weekend")</w:t>
-      </w:r>
-    </w:p>
-    <w:p>
-      <w:pPr>
-        <w:spacing w:after="0" w:line="240" w:lineRule="auto"/>
-        <w:rPr>
-          <w:bCs/>
-          <w:color w:val="000000"/>
-        </w:rPr>
-      </w:pPr>
-      <w:proofErr w:type="spellStart"/>
-      <w:r>
-        <w:rPr>
-          <w:bCs/>
-          <w:color w:val="000000"/>
-        </w:rPr>
-        <w:t>elif</w:t>
-      </w:r>
-      <w:proofErr w:type="spellEnd"/>
-      <w:r>
-        <w:rPr>
-          <w:bCs/>
-          <w:color w:val="000000"/>
-        </w:rPr>
-        <w:t xml:space="preserve"> day == "SUNDAY":</w:t>
-      </w:r>
-    </w:p>
-    <w:p>
-      <w:pPr>
-        <w:spacing w:after="0" w:line="240" w:lineRule="auto"/>
-        <w:rPr>
-          <w:bCs/>
-          <w:color w:val="000000"/>
-        </w:rPr>
-      </w:pPr>
-      <w:r>
-        <w:rPr>
-          <w:bCs/>
-          <w:color w:val="000000"/>
-        </w:rPr>
-        <w:t xml:space="preserve">    </w:t>
-      </w:r>
-      <w:proofErr w:type="gramStart"/>
-      <w:r>
-        <w:rPr>
-          <w:bCs/>
-          <w:color w:val="000000"/>
-        </w:rPr>
-        <w:t>print(</w:t>
-      </w:r>
-      <w:proofErr w:type="gramEnd"/>
-      <w:r>
-        <w:rPr>
-          <w:bCs/>
-          <w:color w:val="000000"/>
-        </w:rPr>
-        <w:t>"Yay! It's a holiday")</w:t>
+        <w:t>    print("It's a week day")</w:t>
+      </w:r>
+    </w:p>
+    <w:p>
+      <w:pPr>
+        <w:spacing w:after="0" w:line="240" w:lineRule="auto"/>
+        <w:rPr>
+          <w:bCs/>
+          <w:color w:val="000000"/>
+        </w:rPr>
+      </w:pPr>
+      <w:r>
+        <w:rPr>
+          <w:bCs/>
+          <w:color w:val="000000"/>
+        </w:rPr>
+        <w:t>elif day == "SATURDAY":</w:t>
+      </w:r>
+    </w:p>
+    <w:p>
+      <w:pPr>
+        <w:spacing w:after="0" w:line="240" w:lineRule="auto"/>
+        <w:rPr>
+          <w:bCs/>
+          <w:color w:val="000000"/>
+        </w:rPr>
+      </w:pPr>
+      <w:r>
+        <w:rPr>
+          <w:bCs/>
+          <w:color w:val="000000"/>
+        </w:rPr>
+        <w:t>    print("It's weekend")</w:t>
+      </w:r>
+    </w:p>
+    <w:p>
+      <w:pPr>
+        <w:spacing w:after="0" w:line="240" w:lineRule="auto"/>
+        <w:rPr>
+          <w:bCs/>
+          <w:color w:val="000000"/>
+        </w:rPr>
+      </w:pPr>
+      <w:r>
+        <w:rPr>
+          <w:bCs/>
+          <w:color w:val="000000"/>
+        </w:rPr>
+        <w:t>elif day == "SUNDAY":</w:t>
+      </w:r>
+    </w:p>
+    <w:p>
+      <w:pPr>
+        <w:spacing w:after="0" w:line="240" w:lineRule="auto"/>
+        <w:rPr>
+          <w:bCs/>
+          <w:color w:val="000000"/>
+        </w:rPr>
+      </w:pPr>
+      <w:r>
+        <w:rPr>
+          <w:bCs/>
+          <w:color w:val="000000"/>
+        </w:rPr>
+        <w:t>    print("Yay! It's a holiday")</w:t>
       </w:r>
     </w:p>
     <w:p>
@@ -4274,23 +3429,7 @@
           <w:bCs/>
           <w:color w:val="000000"/>
         </w:rPr>
-        <w:t xml:space="preserve">    </w:t>
-      </w:r>
-      <w:proofErr w:type="gramStart"/>
-      <w:r>
-        <w:rPr>
-          <w:bCs/>
-          <w:color w:val="000000"/>
-        </w:rPr>
-        <w:t>print(</w:t>
-      </w:r>
-      <w:proofErr w:type="gramEnd"/>
-      <w:r>
-        <w:rPr>
-          <w:bCs/>
-          <w:color w:val="000000"/>
-        </w:rPr>
-        <w:t>"Invalid day name")</w:t>
+        <w:t>    print("Invalid day name")</w:t>
       </w:r>
     </w:p>
     <w:p>
@@ -4428,23 +3567,7 @@
           <w:bCs/>
           <w:color w:val="000000"/>
         </w:rPr>
-        <w:t xml:space="preserve">age = </w:t>
-      </w:r>
-      <w:proofErr w:type="gramStart"/>
-      <w:r>
-        <w:rPr>
-          <w:bCs/>
-          <w:color w:val="000000"/>
-        </w:rPr>
-        <w:t>int(input(</w:t>
-      </w:r>
-      <w:proofErr w:type="gramEnd"/>
-      <w:r>
-        <w:rPr>
-          <w:bCs/>
-          <w:color w:val="000000"/>
-        </w:rPr>
-        <w:t>"Enter your age: "))</w:t>
+        <w:t>age = int(input("Enter your age: "))</w:t>
       </w:r>
     </w:p>
     <w:p>
@@ -5015,319 +4138,137 @@
           <w:bCs/>
           <w:color w:val="000000"/>
         </w:rPr>
-        <w:t xml:space="preserve">marks1 = </w:t>
-      </w:r>
-      <w:proofErr w:type="gramStart"/>
-      <w:r>
-        <w:rPr>
-          <w:bCs/>
-          <w:color w:val="000000"/>
-        </w:rPr>
-        <w:t>float(input(</w:t>
-      </w:r>
-      <w:proofErr w:type="gramEnd"/>
-      <w:r>
-        <w:rPr>
-          <w:bCs/>
-          <w:color w:val="000000"/>
-        </w:rPr>
-        <w:t>"Enter marks obtained in subject 1: "))</w:t>
-      </w:r>
-    </w:p>
-    <w:p>
-      <w:pPr>
-        <w:spacing w:after="0" w:line="240" w:lineRule="auto"/>
-        <w:rPr>
-          <w:bCs/>
-          <w:color w:val="000000"/>
-        </w:rPr>
-      </w:pPr>
-      <w:r>
-        <w:rPr>
-          <w:bCs/>
-          <w:color w:val="000000"/>
-        </w:rPr>
-        <w:t xml:space="preserve">marks2 = </w:t>
-      </w:r>
-      <w:proofErr w:type="gramStart"/>
-      <w:r>
-        <w:rPr>
-          <w:bCs/>
-          <w:color w:val="000000"/>
-        </w:rPr>
-        <w:t>float(input(</w:t>
-      </w:r>
-      <w:proofErr w:type="gramEnd"/>
-      <w:r>
-        <w:rPr>
-          <w:bCs/>
-          <w:color w:val="000000"/>
-        </w:rPr>
-        <w:t>"Enter marks obtained in subject 2: "))</w:t>
-      </w:r>
-    </w:p>
-    <w:p>
-      <w:pPr>
-        <w:spacing w:after="0" w:line="240" w:lineRule="auto"/>
-        <w:rPr>
-          <w:bCs/>
-          <w:color w:val="000000"/>
-        </w:rPr>
-      </w:pPr>
-      <w:r>
-        <w:rPr>
-          <w:bCs/>
-          <w:color w:val="000000"/>
-        </w:rPr>
-        <w:t xml:space="preserve">marks3 = </w:t>
-      </w:r>
-      <w:proofErr w:type="gramStart"/>
-      <w:r>
-        <w:rPr>
-          <w:bCs/>
-          <w:color w:val="000000"/>
-        </w:rPr>
-        <w:t>float(input(</w:t>
-      </w:r>
-      <w:proofErr w:type="gramEnd"/>
-      <w:r>
-        <w:rPr>
-          <w:bCs/>
-          <w:color w:val="000000"/>
-        </w:rPr>
-        <w:t>"Enter marks obtained in subject 3: "))</w:t>
-      </w:r>
-    </w:p>
-    <w:p>
-      <w:pPr>
-        <w:spacing w:after="0" w:line="240" w:lineRule="auto"/>
-        <w:rPr>
-          <w:bCs/>
-          <w:color w:val="000000"/>
-        </w:rPr>
-      </w:pPr>
-    </w:p>
-    <w:p>
-      <w:pPr>
-        <w:spacing w:after="0" w:line="240" w:lineRule="auto"/>
-        <w:rPr>
-          <w:bCs/>
-          <w:color w:val="000000"/>
-        </w:rPr>
-      </w:pPr>
-      <w:proofErr w:type="spellStart"/>
-      <w:r>
-        <w:rPr>
-          <w:bCs/>
-          <w:color w:val="000000"/>
-        </w:rPr>
-        <w:t>total_marks</w:t>
-      </w:r>
-      <w:proofErr w:type="spellEnd"/>
-      <w:r>
-        <w:rPr>
-          <w:bCs/>
-          <w:color w:val="000000"/>
-        </w:rPr>
-        <w:t xml:space="preserve"> = </w:t>
-      </w:r>
-      <w:proofErr w:type="gramStart"/>
-      <w:r>
-        <w:rPr>
-          <w:bCs/>
-          <w:color w:val="000000"/>
-        </w:rPr>
-        <w:t>float(input(</w:t>
-      </w:r>
-      <w:proofErr w:type="gramEnd"/>
-      <w:r>
-        <w:rPr>
-          <w:bCs/>
-          <w:color w:val="000000"/>
-        </w:rPr>
-        <w:t>"Enter total marks: "))</w:t>
-      </w:r>
-    </w:p>
-    <w:p>
-      <w:pPr>
-        <w:spacing w:after="0" w:line="240" w:lineRule="auto"/>
-        <w:rPr>
-          <w:bCs/>
-          <w:color w:val="000000"/>
-        </w:rPr>
-      </w:pPr>
-    </w:p>
-    <w:p>
-      <w:pPr>
-        <w:spacing w:after="0" w:line="240" w:lineRule="auto"/>
-        <w:rPr>
-          <w:bCs/>
-          <w:color w:val="000000"/>
-        </w:rPr>
-      </w:pPr>
-      <w:proofErr w:type="spellStart"/>
-      <w:r>
-        <w:rPr>
-          <w:bCs/>
-          <w:color w:val="000000"/>
-        </w:rPr>
-        <w:t>total_obtained</w:t>
-      </w:r>
-      <w:proofErr w:type="spellEnd"/>
-      <w:r>
-        <w:rPr>
-          <w:bCs/>
-          <w:color w:val="000000"/>
-        </w:rPr>
-        <w:t xml:space="preserve"> = marks1 + marks2 + marks3</w:t>
-      </w:r>
-    </w:p>
-    <w:p>
-      <w:pPr>
-        <w:spacing w:after="0" w:line="240" w:lineRule="auto"/>
-        <w:rPr>
-          <w:bCs/>
-          <w:color w:val="000000"/>
-        </w:rPr>
-      </w:pPr>
-      <w:r>
-        <w:rPr>
-          <w:bCs/>
-          <w:color w:val="000000"/>
-        </w:rPr>
-        <w:t>percentage = (</w:t>
-      </w:r>
-      <w:proofErr w:type="spellStart"/>
-      <w:r>
-        <w:rPr>
-          <w:bCs/>
-          <w:color w:val="000000"/>
-        </w:rPr>
-        <w:t>total_obtained</w:t>
-      </w:r>
-      <w:proofErr w:type="spellEnd"/>
-      <w:r>
-        <w:rPr>
-          <w:bCs/>
-          <w:color w:val="000000"/>
-        </w:rPr>
-        <w:t xml:space="preserve"> / </w:t>
-      </w:r>
-      <w:proofErr w:type="spellStart"/>
-      <w:r>
-        <w:rPr>
-          <w:bCs/>
-          <w:color w:val="000000"/>
-        </w:rPr>
-        <w:t>total_marks</w:t>
-      </w:r>
-      <w:proofErr w:type="spellEnd"/>
-      <w:r>
-        <w:rPr>
-          <w:bCs/>
-          <w:color w:val="000000"/>
-        </w:rPr>
-        <w:t>) * 100</w:t>
-      </w:r>
-    </w:p>
-    <w:p>
-      <w:pPr>
-        <w:spacing w:after="0" w:line="240" w:lineRule="auto"/>
-        <w:rPr>
-          <w:bCs/>
-          <w:color w:val="000000"/>
-        </w:rPr>
-      </w:pPr>
-      <w:proofErr w:type="gramStart"/>
-      <w:r>
-        <w:rPr>
-          <w:bCs/>
-          <w:color w:val="000000"/>
-        </w:rPr>
-        <w:t>print(</w:t>
-      </w:r>
-      <w:proofErr w:type="spellStart"/>
-      <w:proofErr w:type="gramEnd"/>
-      <w:r>
-        <w:rPr>
-          <w:bCs/>
-          <w:color w:val="000000"/>
-        </w:rPr>
-        <w:t>f"Total</w:t>
-      </w:r>
-      <w:proofErr w:type="spellEnd"/>
-      <w:r>
-        <w:rPr>
-          <w:bCs/>
-          <w:color w:val="000000"/>
-        </w:rPr>
-        <w:t xml:space="preserve"> Marks Obtained: {</w:t>
-      </w:r>
-      <w:proofErr w:type="spellStart"/>
-      <w:r>
-        <w:rPr>
-          <w:bCs/>
-          <w:color w:val="000000"/>
-        </w:rPr>
-        <w:t>total_obtained</w:t>
-      </w:r>
-      <w:proofErr w:type="spellEnd"/>
-      <w:r>
-        <w:rPr>
-          <w:bCs/>
-          <w:color w:val="000000"/>
-        </w:rPr>
-        <w:t>}")</w:t>
-      </w:r>
-    </w:p>
-    <w:p>
-      <w:pPr>
-        <w:spacing w:after="0" w:line="240" w:lineRule="auto"/>
-        <w:rPr>
-          <w:bCs/>
-          <w:color w:val="000000"/>
-        </w:rPr>
-      </w:pPr>
-      <w:proofErr w:type="gramStart"/>
-      <w:r>
-        <w:rPr>
-          <w:bCs/>
-          <w:color w:val="000000"/>
-        </w:rPr>
-        <w:t>print(</w:t>
-      </w:r>
-      <w:proofErr w:type="spellStart"/>
-      <w:proofErr w:type="gramEnd"/>
-      <w:r>
-        <w:rPr>
-          <w:bCs/>
-          <w:color w:val="000000"/>
-        </w:rPr>
-        <w:t>f"Percentage</w:t>
-      </w:r>
-      <w:proofErr w:type="spellEnd"/>
-      <w:r>
-        <w:rPr>
-          <w:bCs/>
-          <w:color w:val="000000"/>
-        </w:rPr>
-        <w:t>: {percentage:.2</w:t>
-      </w:r>
-      <w:proofErr w:type="gramStart"/>
-      <w:r>
-        <w:rPr>
-          <w:bCs/>
-          <w:color w:val="000000"/>
-        </w:rPr>
-        <w:t>f}%</w:t>
-      </w:r>
-      <w:proofErr w:type="gramEnd"/>
-      <w:r>
-        <w:rPr>
-          <w:bCs/>
-          <w:color w:val="000000"/>
-        </w:rPr>
-        <w:t>")</w:t>
+        <w:t>marks1 = float(input("Enter marks obtained in subject 1: "))</w:t>
+      </w:r>
+    </w:p>
+    <w:p>
+      <w:pPr>
+        <w:spacing w:after="0" w:line="240" w:lineRule="auto"/>
+        <w:rPr>
+          <w:bCs/>
+          <w:color w:val="000000"/>
+        </w:rPr>
+      </w:pPr>
+      <w:r>
+        <w:rPr>
+          <w:bCs/>
+          <w:color w:val="000000"/>
+        </w:rPr>
+        <w:t>marks2 = float(input("Enter marks obtained in subject 2: "))</w:t>
+      </w:r>
+    </w:p>
+    <w:p>
+      <w:pPr>
+        <w:spacing w:after="0" w:line="240" w:lineRule="auto"/>
+        <w:rPr>
+          <w:bCs/>
+          <w:color w:val="000000"/>
+        </w:rPr>
+      </w:pPr>
+      <w:r>
+        <w:rPr>
+          <w:bCs/>
+          <w:color w:val="000000"/>
+        </w:rPr>
+        <w:t>marks3 = float(input("Enter marks obtained in subject 3: "))</w:t>
+      </w:r>
+    </w:p>
+    <w:p>
+      <w:pPr>
+        <w:spacing w:after="0" w:line="240" w:lineRule="auto"/>
+        <w:rPr>
+          <w:bCs/>
+          <w:color w:val="000000"/>
+        </w:rPr>
+      </w:pPr>
+    </w:p>
+    <w:p>
+      <w:pPr>
+        <w:spacing w:after="0" w:line="240" w:lineRule="auto"/>
+        <w:rPr>
+          <w:bCs/>
+          <w:color w:val="000000"/>
+        </w:rPr>
+      </w:pPr>
+      <w:r>
+        <w:rPr>
+          <w:bCs/>
+          <w:color w:val="000000"/>
+        </w:rPr>
+        <w:t>total_marks = float(input("Enter total marks: "))</w:t>
+      </w:r>
+    </w:p>
+    <w:p>
+      <w:pPr>
+        <w:spacing w:after="0" w:line="240" w:lineRule="auto"/>
+        <w:rPr>
+          <w:bCs/>
+          <w:color w:val="000000"/>
+        </w:rPr>
+      </w:pPr>
+    </w:p>
+    <w:p>
+      <w:pPr>
+        <w:spacing w:after="0" w:line="240" w:lineRule="auto"/>
+        <w:rPr>
+          <w:bCs/>
+          <w:color w:val="000000"/>
+        </w:rPr>
+      </w:pPr>
+      <w:r>
+        <w:rPr>
+          <w:bCs/>
+          <w:color w:val="000000"/>
+        </w:rPr>
+        <w:t>total_obtained = marks1 + marks2 + marks3</w:t>
+      </w:r>
+    </w:p>
+    <w:p>
+      <w:pPr>
+        <w:spacing w:after="0" w:line="240" w:lineRule="auto"/>
+        <w:rPr>
+          <w:bCs/>
+          <w:color w:val="000000"/>
+        </w:rPr>
+      </w:pPr>
+      <w:r>
+        <w:rPr>
+          <w:bCs/>
+          <w:color w:val="000000"/>
+        </w:rPr>
+        <w:t>percentage = (total_obtained / total_marks) * 100</w:t>
+      </w:r>
+    </w:p>
+    <w:p>
+      <w:pPr>
+        <w:spacing w:after="0" w:line="240" w:lineRule="auto"/>
+        <w:rPr>
+          <w:bCs/>
+          <w:color w:val="000000"/>
+        </w:rPr>
+      </w:pPr>
+      <w:r>
+        <w:rPr>
+          <w:bCs/>
+          <w:color w:val="000000"/>
+        </w:rPr>
+        <w:t>print(f"Total Marks Obtained: {total_obtained}")</w:t>
+      </w:r>
+    </w:p>
+    <w:p>
+      <w:pPr>
+        <w:spacing w:after="0" w:line="240" w:lineRule="auto"/>
+        <w:rPr>
+          <w:bCs/>
+          <w:color w:val="000000"/>
+        </w:rPr>
+      </w:pPr>
+      <w:r>
+        <w:rPr>
+          <w:bCs/>
+          <w:color w:val="000000"/>
+        </w:rPr>
+        <w:t>print(f"Percentage: {percentage:.2f}%")</w:t>
       </w:r>
     </w:p>
     <w:p>
@@ -5368,233 +4309,119 @@
           <w:bCs/>
           <w:color w:val="000000"/>
         </w:rPr>
-        <w:t xml:space="preserve">    </w:t>
-      </w:r>
-      <w:proofErr w:type="gramStart"/>
-      <w:r>
-        <w:rPr>
-          <w:bCs/>
-          <w:color w:val="000000"/>
-        </w:rPr>
-        <w:t>print(</w:t>
-      </w:r>
-      <w:proofErr w:type="gramEnd"/>
-      <w:r>
-        <w:rPr>
-          <w:bCs/>
-          <w:color w:val="000000"/>
-        </w:rPr>
-        <w:t>"Grade: A-one")</w:t>
-      </w:r>
-    </w:p>
-    <w:p>
-      <w:pPr>
-        <w:spacing w:after="0" w:line="240" w:lineRule="auto"/>
-        <w:rPr>
-          <w:bCs/>
-          <w:color w:val="000000"/>
-        </w:rPr>
-      </w:pPr>
-      <w:r>
-        <w:rPr>
-          <w:bCs/>
-          <w:color w:val="000000"/>
-        </w:rPr>
-        <w:t xml:space="preserve">    </w:t>
-      </w:r>
-      <w:proofErr w:type="gramStart"/>
-      <w:r>
-        <w:rPr>
-          <w:bCs/>
-          <w:color w:val="000000"/>
-        </w:rPr>
-        <w:t>print(</w:t>
-      </w:r>
-      <w:proofErr w:type="gramEnd"/>
-      <w:r>
-        <w:rPr>
-          <w:bCs/>
-          <w:color w:val="000000"/>
-        </w:rPr>
-        <w:t>"Remarks: Excellent")</w:t>
-      </w:r>
-    </w:p>
-    <w:p>
-      <w:pPr>
-        <w:spacing w:after="0" w:line="240" w:lineRule="auto"/>
-        <w:rPr>
-          <w:bCs/>
-          <w:color w:val="000000"/>
-        </w:rPr>
-      </w:pPr>
-      <w:proofErr w:type="spellStart"/>
-      <w:r>
-        <w:rPr>
-          <w:bCs/>
-          <w:color w:val="000000"/>
-        </w:rPr>
-        <w:t>elif</w:t>
-      </w:r>
-      <w:proofErr w:type="spellEnd"/>
-      <w:r>
-        <w:rPr>
-          <w:bCs/>
-          <w:color w:val="000000"/>
-        </w:rPr>
-        <w:t xml:space="preserve"> percentage &gt;= 70:</w:t>
-      </w:r>
-    </w:p>
-    <w:p>
-      <w:pPr>
-        <w:spacing w:after="0" w:line="240" w:lineRule="auto"/>
-        <w:rPr>
-          <w:bCs/>
-          <w:color w:val="000000"/>
-        </w:rPr>
-      </w:pPr>
-      <w:r>
-        <w:rPr>
-          <w:bCs/>
-          <w:color w:val="000000"/>
-        </w:rPr>
-        <w:t xml:space="preserve">    </w:t>
-      </w:r>
-      <w:proofErr w:type="gramStart"/>
-      <w:r>
-        <w:rPr>
-          <w:bCs/>
-          <w:color w:val="000000"/>
-        </w:rPr>
-        <w:t>print(</w:t>
-      </w:r>
-      <w:proofErr w:type="gramEnd"/>
-      <w:r>
-        <w:rPr>
-          <w:bCs/>
-          <w:color w:val="000000"/>
-        </w:rPr>
-        <w:t>"Grade: A")</w:t>
-      </w:r>
-    </w:p>
-    <w:p>
-      <w:pPr>
-        <w:spacing w:after="0" w:line="240" w:lineRule="auto"/>
-        <w:rPr>
-          <w:bCs/>
-          <w:color w:val="000000"/>
-        </w:rPr>
-      </w:pPr>
-      <w:r>
-        <w:rPr>
-          <w:bCs/>
-          <w:color w:val="000000"/>
-        </w:rPr>
-        <w:t xml:space="preserve">    </w:t>
-      </w:r>
-      <w:proofErr w:type="gramStart"/>
-      <w:r>
-        <w:rPr>
-          <w:bCs/>
-          <w:color w:val="000000"/>
-        </w:rPr>
-        <w:t>print(</w:t>
-      </w:r>
-      <w:proofErr w:type="gramEnd"/>
-      <w:r>
-        <w:rPr>
-          <w:bCs/>
-          <w:color w:val="000000"/>
-        </w:rPr>
-        <w:t>"Remarks: Good")</w:t>
-      </w:r>
-    </w:p>
-    <w:p>
-      <w:pPr>
-        <w:spacing w:after="0" w:line="240" w:lineRule="auto"/>
-        <w:rPr>
-          <w:bCs/>
-          <w:color w:val="000000"/>
-        </w:rPr>
-      </w:pPr>
-      <w:proofErr w:type="spellStart"/>
-      <w:r>
-        <w:rPr>
-          <w:bCs/>
-          <w:color w:val="000000"/>
-        </w:rPr>
-        <w:t>elif</w:t>
-      </w:r>
-      <w:proofErr w:type="spellEnd"/>
-      <w:r>
-        <w:rPr>
-          <w:bCs/>
-          <w:color w:val="000000"/>
-        </w:rPr>
-        <w:t xml:space="preserve"> percentage &gt;= 60:</w:t>
-      </w:r>
-    </w:p>
-    <w:p>
-      <w:pPr>
-        <w:spacing w:after="0" w:line="240" w:lineRule="auto"/>
-        <w:rPr>
-          <w:bCs/>
-          <w:color w:val="000000"/>
-        </w:rPr>
-      </w:pPr>
-      <w:r>
-        <w:rPr>
-          <w:bCs/>
-          <w:color w:val="000000"/>
-        </w:rPr>
-        <w:t xml:space="preserve">    </w:t>
-      </w:r>
-      <w:proofErr w:type="gramStart"/>
-      <w:r>
-        <w:rPr>
-          <w:bCs/>
-          <w:color w:val="000000"/>
-        </w:rPr>
-        <w:t>print(</w:t>
-      </w:r>
-      <w:proofErr w:type="gramEnd"/>
-      <w:r>
-        <w:rPr>
-          <w:bCs/>
-          <w:color w:val="000000"/>
-        </w:rPr>
-        <w:t>"Grade: B")</w:t>
-      </w:r>
-    </w:p>
-    <w:p>
-      <w:pPr>
-        <w:spacing w:after="0" w:line="240" w:lineRule="auto"/>
-        <w:rPr>
-          <w:bCs/>
-          <w:color w:val="000000"/>
-        </w:rPr>
-      </w:pPr>
-      <w:r>
-        <w:rPr>
-          <w:bCs/>
-          <w:color w:val="000000"/>
-        </w:rPr>
-        <w:t xml:space="preserve">    </w:t>
-      </w:r>
-      <w:proofErr w:type="gramStart"/>
-      <w:r>
-        <w:rPr>
-          <w:bCs/>
-          <w:color w:val="000000"/>
-        </w:rPr>
-        <w:t>print(</w:t>
-      </w:r>
-      <w:proofErr w:type="gramEnd"/>
-      <w:r>
-        <w:rPr>
-          <w:bCs/>
-          <w:color w:val="000000"/>
-        </w:rPr>
-        <w:t>"Remarks: You need to improve")</w:t>
+        <w:t>    print("Grade: A-one")</w:t>
+      </w:r>
+    </w:p>
+    <w:p>
+      <w:pPr>
+        <w:spacing w:after="0" w:line="240" w:lineRule="auto"/>
+        <w:rPr>
+          <w:bCs/>
+          <w:color w:val="000000"/>
+        </w:rPr>
+      </w:pPr>
+      <w:r>
+        <w:rPr>
+          <w:bCs/>
+          <w:color w:val="000000"/>
+        </w:rPr>
+        <w:t>    print("Remarks: Excellent")</w:t>
+      </w:r>
+    </w:p>
+    <w:p>
+      <w:pPr>
+        <w:spacing w:after="0" w:line="240" w:lineRule="auto"/>
+        <w:rPr>
+          <w:bCs/>
+          <w:color w:val="000000"/>
+        </w:rPr>
+      </w:pPr>
+      <w:r>
+        <w:rPr>
+          <w:bCs/>
+          <w:color w:val="000000"/>
+        </w:rPr>
+        <w:t>elif percentage &gt;= 70:</w:t>
+      </w:r>
+    </w:p>
+    <w:p>
+      <w:pPr>
+        <w:spacing w:after="0" w:line="240" w:lineRule="auto"/>
+        <w:rPr>
+          <w:bCs/>
+          <w:color w:val="000000"/>
+        </w:rPr>
+      </w:pPr>
+      <w:r>
+        <w:rPr>
+          <w:bCs/>
+          <w:color w:val="000000"/>
+        </w:rPr>
+        <w:t>    print("Grade: A")</w:t>
+      </w:r>
+    </w:p>
+    <w:p>
+      <w:pPr>
+        <w:spacing w:after="0" w:line="240" w:lineRule="auto"/>
+        <w:rPr>
+          <w:bCs/>
+          <w:color w:val="000000"/>
+        </w:rPr>
+      </w:pPr>
+      <w:r>
+        <w:rPr>
+          <w:bCs/>
+          <w:color w:val="000000"/>
+        </w:rPr>
+        <w:t>    print("Remarks: Good")</w:t>
+      </w:r>
+    </w:p>
+    <w:p>
+      <w:pPr>
+        <w:spacing w:after="0" w:line="240" w:lineRule="auto"/>
+        <w:rPr>
+          <w:bCs/>
+          <w:color w:val="000000"/>
+        </w:rPr>
+      </w:pPr>
+      <w:r>
+        <w:rPr>
+          <w:bCs/>
+          <w:color w:val="000000"/>
+        </w:rPr>
+        <w:t>elif percentage &gt;= 60:</w:t>
+      </w:r>
+    </w:p>
+    <w:p>
+      <w:pPr>
+        <w:spacing w:after="0" w:line="240" w:lineRule="auto"/>
+        <w:rPr>
+          <w:bCs/>
+          <w:color w:val="000000"/>
+        </w:rPr>
+      </w:pPr>
+      <w:r>
+        <w:rPr>
+          <w:bCs/>
+          <w:color w:val="000000"/>
+        </w:rPr>
+        <w:t>    print("Grade: B")</w:t>
+      </w:r>
+    </w:p>
+    <w:p>
+      <w:pPr>
+        <w:spacing w:after="0" w:line="240" w:lineRule="auto"/>
+        <w:rPr>
+          <w:bCs/>
+          <w:color w:val="000000"/>
+        </w:rPr>
+      </w:pPr>
+      <w:r>
+        <w:rPr>
+          <w:bCs/>
+          <w:color w:val="000000"/>
+        </w:rPr>
+        <w:t>    print("Remarks: You need to improve")</w:t>
       </w:r>
     </w:p>
     <w:p>
@@ -5626,55 +4453,23 @@
           <w:bCs/>
           <w:color w:val="000000"/>
         </w:rPr>
-        <w:t xml:space="preserve">    </w:t>
-      </w:r>
-      <w:proofErr w:type="gramStart"/>
-      <w:r>
-        <w:rPr>
-          <w:bCs/>
-          <w:color w:val="000000"/>
-        </w:rPr>
-        <w:t>print(</w:t>
-      </w:r>
-      <w:proofErr w:type="gramEnd"/>
-      <w:r>
-        <w:rPr>
-          <w:bCs/>
-          <w:color w:val="000000"/>
-        </w:rPr>
-        <w:t>"Grade: Fail")</w:t>
-      </w:r>
-    </w:p>
-    <w:p>
-      <w:pPr>
-        <w:spacing w:after="0" w:line="240" w:lineRule="auto"/>
-        <w:rPr>
-          <w:bCs/>
-          <w:color w:val="000000"/>
-        </w:rPr>
-      </w:pPr>
-      <w:r>
-        <w:rPr>
-          <w:bCs/>
-          <w:color w:val="000000"/>
-        </w:rPr>
-        <w:t xml:space="preserve">    </w:t>
-      </w:r>
-      <w:proofErr w:type="gramStart"/>
-      <w:r>
-        <w:rPr>
-          <w:bCs/>
-          <w:color w:val="000000"/>
-        </w:rPr>
-        <w:t>print(</w:t>
-      </w:r>
-      <w:proofErr w:type="gramEnd"/>
-      <w:r>
-        <w:rPr>
-          <w:bCs/>
-          <w:color w:val="000000"/>
-        </w:rPr>
-        <w:t>"Remarks: Sorry")</w:t>
+        <w:t>    print("Grade: Fail")</w:t>
+      </w:r>
+    </w:p>
+    <w:p>
+      <w:pPr>
+        <w:spacing w:after="0" w:line="240" w:lineRule="auto"/>
+        <w:rPr>
+          <w:bCs/>
+          <w:color w:val="000000"/>
+        </w:rPr>
+      </w:pPr>
+      <w:r>
+        <w:rPr>
+          <w:bCs/>
+          <w:color w:val="000000"/>
+        </w:rPr>
+        <w:t>    print("Remarks: Sorry")</w:t>
       </w:r>
     </w:p>
     <w:p>
@@ -5776,23 +4571,7 @@
           <w:bCs/>
           <w:color w:val="000000"/>
         </w:rPr>
-        <w:t xml:space="preserve">num = </w:t>
-      </w:r>
-      <w:proofErr w:type="gramStart"/>
-      <w:r>
-        <w:rPr>
-          <w:bCs/>
-          <w:color w:val="000000"/>
-        </w:rPr>
-        <w:t>float(input(</w:t>
-      </w:r>
-      <w:proofErr w:type="gramEnd"/>
-      <w:r>
-        <w:rPr>
-          <w:bCs/>
-          <w:color w:val="000000"/>
-        </w:rPr>
-        <w:t>"Enter a positive number: "))</w:t>
+        <w:t>num = float(input("Enter a positive number: "))</w:t>
       </w:r>
     </w:p>
     <w:p>
@@ -6247,103 +5026,39 @@
           <w:bCs/>
           <w:color w:val="000000"/>
         </w:rPr>
-        <w:t xml:space="preserve">for </w:t>
-      </w:r>
-      <w:proofErr w:type="spellStart"/>
-      <w:r>
-        <w:rPr>
-          <w:bCs/>
-          <w:color w:val="000000"/>
-        </w:rPr>
-        <w:t>i</w:t>
-      </w:r>
-      <w:proofErr w:type="spellEnd"/>
-      <w:r>
-        <w:rPr>
-          <w:bCs/>
-          <w:color w:val="000000"/>
-        </w:rPr>
-        <w:t xml:space="preserve"> in </w:t>
-      </w:r>
-      <w:proofErr w:type="gramStart"/>
-      <w:r>
-        <w:rPr>
-          <w:bCs/>
-          <w:color w:val="000000"/>
-        </w:rPr>
-        <w:t>range(</w:t>
-      </w:r>
-      <w:proofErr w:type="gramEnd"/>
-      <w:r>
-        <w:rPr>
-          <w:bCs/>
-          <w:color w:val="000000"/>
-        </w:rPr>
-        <w:t>1, 21):</w:t>
-      </w:r>
-    </w:p>
-    <w:p>
-      <w:pPr>
-        <w:spacing w:after="0" w:line="240" w:lineRule="auto"/>
-        <w:rPr>
-          <w:bCs/>
-          <w:color w:val="000000"/>
-        </w:rPr>
-      </w:pPr>
-      <w:r>
-        <w:rPr>
-          <w:bCs/>
-          <w:color w:val="000000"/>
-        </w:rPr>
-        <w:t xml:space="preserve">    if </w:t>
-      </w:r>
-      <w:proofErr w:type="spellStart"/>
-      <w:r>
-        <w:rPr>
-          <w:bCs/>
-          <w:color w:val="000000"/>
-        </w:rPr>
-        <w:t>i</w:t>
-      </w:r>
-      <w:proofErr w:type="spellEnd"/>
-      <w:r>
-        <w:rPr>
-          <w:bCs/>
-          <w:color w:val="000000"/>
-        </w:rPr>
-        <w:t xml:space="preserve"> % 2 == 0:</w:t>
-      </w:r>
-    </w:p>
-    <w:p>
-      <w:pPr>
-        <w:spacing w:after="0" w:line="240" w:lineRule="auto"/>
-        <w:rPr>
-          <w:bCs/>
-          <w:color w:val="000000"/>
-        </w:rPr>
-      </w:pPr>
-      <w:r>
-        <w:rPr>
-          <w:bCs/>
-          <w:color w:val="000000"/>
-        </w:rPr>
-        <w:t>        print(f"{</w:t>
-      </w:r>
-      <w:proofErr w:type="spellStart"/>
-      <w:r>
-        <w:rPr>
-          <w:bCs/>
-          <w:color w:val="000000"/>
-        </w:rPr>
-        <w:t>i</w:t>
-      </w:r>
-      <w:proofErr w:type="spellEnd"/>
-      <w:r>
-        <w:rPr>
-          <w:bCs/>
-          <w:color w:val="000000"/>
-        </w:rPr>
-        <w:t>} is Even")</w:t>
+        <w:t>for i in range(1, 21):</w:t>
+      </w:r>
+    </w:p>
+    <w:p>
+      <w:pPr>
+        <w:spacing w:after="0" w:line="240" w:lineRule="auto"/>
+        <w:rPr>
+          <w:bCs/>
+          <w:color w:val="000000"/>
+        </w:rPr>
+      </w:pPr>
+      <w:r>
+        <w:rPr>
+          <w:bCs/>
+          <w:color w:val="000000"/>
+        </w:rPr>
+        <w:t>    if i % 2 == 0:</w:t>
+      </w:r>
+    </w:p>
+    <w:p>
+      <w:pPr>
+        <w:spacing w:after="0" w:line="240" w:lineRule="auto"/>
+        <w:rPr>
+          <w:bCs/>
+          <w:color w:val="000000"/>
+        </w:rPr>
+      </w:pPr>
+      <w:r>
+        <w:rPr>
+          <w:bCs/>
+          <w:color w:val="000000"/>
+        </w:rPr>
+        <w:t>        print(f"{i} is Even")</w:t>
       </w:r>
     </w:p>
     <w:p>
@@ -6375,23 +5090,7 @@
           <w:bCs/>
           <w:color w:val="000000"/>
         </w:rPr>
-        <w:t>        print(f"{</w:t>
-      </w:r>
-      <w:proofErr w:type="spellStart"/>
-      <w:r>
-        <w:rPr>
-          <w:bCs/>
-          <w:color w:val="000000"/>
-        </w:rPr>
-        <w:t>i</w:t>
-      </w:r>
-      <w:proofErr w:type="spellEnd"/>
-      <w:r>
-        <w:rPr>
-          <w:bCs/>
-          <w:color w:val="000000"/>
-        </w:rPr>
-        <w:t>} is Odd")</w:t>
+        <w:t>        print(f"{i} is Odd")</w:t>
       </w:r>
     </w:p>
     <w:p>
@@ -7610,28 +6309,28 @@
 </file>
 
 <file path=customXml/item1.xml><?xml version="1.0" encoding="utf-8"?>
-<b:Sources xmlns:b="http://schemas.openxmlformats.org/officeDocument/2006/bibliography" xmlns="http://schemas.openxmlformats.org/officeDocument/2006/bibliography" SelectedStyle="\APASixthEditionOfficeOnline.xsl" StyleName="APA" Version="6"/>
-</file>
-
-<file path=customXml/item2.xml><?xml version="1.0" encoding="utf-8"?>
 <go:gDocsCustomXmlDataStorage xmlns:go="http://customooxmlschemas.google.com/" xmlns:r="http://schemas.openxmlformats.org/officeDocument/2006/relationships" uri="GoogleDocsCustomDataVersion2">
   <go:docsCustomData xmlns:go="http://customooxmlschemas.google.com/" roundtripDataSignature="AMtx7mhNdRNjg0bVM+xvUCna7odF+TVm+w==">CgMxLjAyCGguZ2pkZ3hzOAByITE1eGM4dkVsTTF2T0t5TEcySXJURWw4aFNGeFh5WmJHRQ==</go:docsCustomData>
 </go:gDocsCustomXmlDataStorage>
 </file>
 
-<file path=customXml/itemProps1.xml><?xml version="1.0" encoding="utf-8"?>
-<ds:datastoreItem xmlns:ds="http://schemas.openxmlformats.org/officeDocument/2006/customXml" ds:itemID="{794EAF63-1631-48A4-9EEB-A95A78F193C5}">
-  <ds:schemaRefs>
-    <ds:schemaRef ds:uri="http://schemas.openxmlformats.org/officeDocument/2006/bibliography"/>
-  </ds:schemaRefs>
-</ds:datastoreItem>
+<file path=customXml/item2.xml><?xml version="1.0" encoding="utf-8"?>
+<b:Sources xmlns:b="http://schemas.openxmlformats.org/officeDocument/2006/bibliography" xmlns="http://schemas.openxmlformats.org/officeDocument/2006/bibliography" SelectedStyle="\APASixthEditionOfficeOnline.xsl" StyleName="APA" Version="6"/>
 </file>
 
-<file path=customXml/itemProps2.xml><?xml version="1.0" encoding="utf-8"?>
+<file path=customXml/itemProps1.xml><?xml version="1.0" encoding="utf-8"?>
 <ds:datastoreItem xmlns:ds="http://schemas.openxmlformats.org/officeDocument/2006/customXml" ds:itemID="{11111111-1234-1234-1234-123412341234}">
   <ds:schemaRefs>
     <ds:schemaRef ds:uri="http://customooxmlschemas.google.com/"/>
     <ds:schemaRef ds:uri="http://schemas.openxmlformats.org/officeDocument/2006/relationships"/>
   </ds:schemaRefs>
 </ds:datastoreItem>
+</file>
+
+<file path=customXml/itemProps2.xml><?xml version="1.0" encoding="utf-8"?>
+<ds:datastoreItem xmlns:ds="http://schemas.openxmlformats.org/officeDocument/2006/customXml" ds:itemID="{794EAF63-1631-48A4-9EEB-A95A78F193C5}">
+  <ds:schemaRefs>
+    <ds:schemaRef ds:uri="http://schemas.openxmlformats.org/officeDocument/2006/bibliography"/>
+  </ds:schemaRefs>
+</ds:datastoreItem>
 </file>
</xml_diff>

<commit_message>
Update department name to MCA and add student details in Lab Report assignments
</commit_message>
<xml_diff>
--- a/First Semester/Python/Lab Task/Lab Report- Assignment 1.docx
+++ b/First Semester/Python/Lab Task/Lab Report- Assignment 1.docx
@@ -108,11 +108,19 @@
           <w:color w:val="000000"/>
         </w:rPr>
       </w:pPr>
-      <w:r>
-        <w:rPr>
-          <w:color w:val="000000"/>
-        </w:rPr>
-        <w:t>Kirtipur, Kathmandu</w:t>
+      <w:proofErr w:type="spellStart"/>
+      <w:r>
+        <w:rPr>
+          <w:color w:val="000000"/>
+        </w:rPr>
+        <w:t>Kirtipur</w:t>
+      </w:r>
+      <w:proofErr w:type="spellEnd"/>
+      <w:r>
+        <w:rPr>
+          <w:color w:val="000000"/>
+        </w:rPr>
+        <w:t>, Kathmandu</w:t>
       </w:r>
     </w:p>
     <w:p>
@@ -379,11 +387,19 @@
           <w:color w:val="000000"/>
         </w:rPr>
       </w:pPr>
-      <w:r>
-        <w:rPr>
-          <w:color w:val="000000"/>
-        </w:rPr>
-        <w:t>Patandhoka, Lalitpur</w:t>
+      <w:proofErr w:type="spellStart"/>
+      <w:r>
+        <w:rPr>
+          <w:color w:val="000000"/>
+        </w:rPr>
+        <w:t>Patandhoka</w:t>
+      </w:r>
+      <w:proofErr w:type="spellEnd"/>
+      <w:r>
+        <w:rPr>
+          <w:color w:val="000000"/>
+        </w:rPr>
+        <w:t>, Lalitpur</w:t>
       </w:r>
     </w:p>
     <w:p>
@@ -1640,28 +1656,71 @@
           <w:color w:val="000000"/>
         </w:rPr>
       </w:pPr>
-      <w:r>
-        <w:rPr>
-          <w:bCs/>
-          <w:color w:val="000000"/>
-        </w:rPr>
-        <w:t>nepali_rupees = (dollar * 133.72) + (riyal * 35.82)</w:t>
-      </w:r>
-    </w:p>
-    <w:p>
-      <w:pPr>
-        <w:spacing w:after="0" w:line="240" w:lineRule="auto"/>
-        <w:rPr>
-          <w:bCs/>
-          <w:color w:val="000000"/>
-        </w:rPr>
-      </w:pPr>
-      <w:r>
-        <w:rPr>
-          <w:bCs/>
-          <w:color w:val="000000"/>
-        </w:rPr>
-        <w:t>print(f"Total currency in NRs: {nepali_rupees}")</w:t>
+      <w:proofErr w:type="spellStart"/>
+      <w:r>
+        <w:rPr>
+          <w:bCs/>
+          <w:color w:val="000000"/>
+        </w:rPr>
+        <w:t>nepali_rupees</w:t>
+      </w:r>
+      <w:proofErr w:type="spellEnd"/>
+      <w:r>
+        <w:rPr>
+          <w:bCs/>
+          <w:color w:val="000000"/>
+        </w:rPr>
+        <w:t xml:space="preserve"> = (dollar * 133.72) + (riyal * 35.82)</w:t>
+      </w:r>
+    </w:p>
+    <w:p>
+      <w:pPr>
+        <w:spacing w:after="0" w:line="240" w:lineRule="auto"/>
+        <w:rPr>
+          <w:bCs/>
+          <w:color w:val="000000"/>
+        </w:rPr>
+      </w:pPr>
+      <w:proofErr w:type="gramStart"/>
+      <w:r>
+        <w:rPr>
+          <w:bCs/>
+          <w:color w:val="000000"/>
+        </w:rPr>
+        <w:t>print(</w:t>
+      </w:r>
+      <w:proofErr w:type="spellStart"/>
+      <w:proofErr w:type="gramEnd"/>
+      <w:r>
+        <w:rPr>
+          <w:bCs/>
+          <w:color w:val="000000"/>
+        </w:rPr>
+        <w:t>f"Total</w:t>
+      </w:r>
+      <w:proofErr w:type="spellEnd"/>
+      <w:r>
+        <w:rPr>
+          <w:bCs/>
+          <w:color w:val="000000"/>
+        </w:rPr>
+        <w:t xml:space="preserve"> currency in NRs: {</w:t>
+      </w:r>
+      <w:proofErr w:type="spellStart"/>
+      <w:r>
+        <w:rPr>
+          <w:bCs/>
+          <w:color w:val="000000"/>
+        </w:rPr>
+        <w:t>nepali_rupees</w:t>
+      </w:r>
+      <w:proofErr w:type="spellEnd"/>
+      <w:r>
+        <w:rPr>
+          <w:bCs/>
+          <w:color w:val="000000"/>
+        </w:rPr>
+        <w:t>}")</w:t>
       </w:r>
     </w:p>
     <w:p>
@@ -1866,7 +1925,20 @@
         <w:t xml:space="preserve">2. </w:t>
       </w:r>
       <w:r>
-        <w:t>Given the initial deposit, the annual interest rate, and the number of years that you invest your money in an investment account. Calculate the final amount of the investment using math.pow() function.</w:t>
+        <w:t xml:space="preserve">Given the initial deposit, the annual interest rate, and the number of years that you invest your money in an investment account. Calculate the final amount of the investment using </w:t>
+      </w:r>
+      <w:proofErr w:type="spellStart"/>
+      <w:proofErr w:type="gramStart"/>
+      <w:r>
+        <w:t>math.pow</w:t>
+      </w:r>
+      <w:proofErr w:type="spellEnd"/>
+      <w:r>
+        <w:t>(</w:t>
+      </w:r>
+      <w:proofErr w:type="gramEnd"/>
+      <w:r>
+        <w:t>) function.</w:t>
       </w:r>
       <w:bookmarkEnd w:id="2"/>
     </w:p>
@@ -1908,80 +1980,205 @@
           <w:bCs/>
           <w:color w:val="000000"/>
         </w:rPr>
-        <w:t>deposit = float(input("Enter the initial deposit: "))</w:t>
-      </w:r>
-    </w:p>
-    <w:p>
-      <w:pPr>
-        <w:spacing w:after="0" w:line="240" w:lineRule="auto"/>
-        <w:rPr>
-          <w:bCs/>
-          <w:color w:val="000000"/>
-        </w:rPr>
-      </w:pPr>
-      <w:r>
-        <w:rPr>
-          <w:bCs/>
-          <w:color w:val="000000"/>
-        </w:rPr>
-        <w:t>interest_rate = float(input("Enter the annual interest rate (in decimal): "))</w:t>
-      </w:r>
-    </w:p>
-    <w:p>
-      <w:pPr>
-        <w:spacing w:after="0" w:line="240" w:lineRule="auto"/>
-        <w:rPr>
-          <w:bCs/>
-          <w:color w:val="000000"/>
-        </w:rPr>
-      </w:pPr>
-      <w:r>
-        <w:rPr>
-          <w:bCs/>
-          <w:color w:val="000000"/>
-        </w:rPr>
-        <w:t>years = int(input("Enter the number of years: "))</w:t>
-      </w:r>
-    </w:p>
-    <w:p>
-      <w:pPr>
-        <w:spacing w:after="0" w:line="240" w:lineRule="auto"/>
-        <w:rPr>
-          <w:bCs/>
-          <w:color w:val="000000"/>
-        </w:rPr>
-      </w:pPr>
-    </w:p>
-    <w:p>
-      <w:pPr>
-        <w:spacing w:after="0" w:line="240" w:lineRule="auto"/>
-        <w:rPr>
-          <w:bCs/>
-          <w:color w:val="000000"/>
-        </w:rPr>
-      </w:pPr>
-      <w:r>
-        <w:rPr>
-          <w:bCs/>
-          <w:color w:val="000000"/>
-        </w:rPr>
-        <w:t>final_amount = deposit * math.pow((1+ interest_rate), years)</w:t>
-      </w:r>
-    </w:p>
-    <w:p>
-      <w:pPr>
-        <w:spacing w:after="0" w:line="240" w:lineRule="auto"/>
-        <w:rPr>
-          <w:bCs/>
-          <w:color w:val="000000"/>
-        </w:rPr>
-      </w:pPr>
-      <w:r>
-        <w:rPr>
-          <w:bCs/>
-          <w:color w:val="000000"/>
-        </w:rPr>
-        <w:t>print(f"The final amount of the investment after {years} years is: {final_amount:.2f}")</w:t>
+        <w:t xml:space="preserve">deposit = </w:t>
+      </w:r>
+      <w:proofErr w:type="gramStart"/>
+      <w:r>
+        <w:rPr>
+          <w:bCs/>
+          <w:color w:val="000000"/>
+        </w:rPr>
+        <w:t>float(input(</w:t>
+      </w:r>
+      <w:proofErr w:type="gramEnd"/>
+      <w:r>
+        <w:rPr>
+          <w:bCs/>
+          <w:color w:val="000000"/>
+        </w:rPr>
+        <w:t>"Enter the initial deposit: "))</w:t>
+      </w:r>
+    </w:p>
+    <w:p>
+      <w:pPr>
+        <w:spacing w:after="0" w:line="240" w:lineRule="auto"/>
+        <w:rPr>
+          <w:bCs/>
+          <w:color w:val="000000"/>
+        </w:rPr>
+      </w:pPr>
+      <w:proofErr w:type="spellStart"/>
+      <w:r>
+        <w:rPr>
+          <w:bCs/>
+          <w:color w:val="000000"/>
+        </w:rPr>
+        <w:t>interest_rate</w:t>
+      </w:r>
+      <w:proofErr w:type="spellEnd"/>
+      <w:r>
+        <w:rPr>
+          <w:bCs/>
+          <w:color w:val="000000"/>
+        </w:rPr>
+        <w:t xml:space="preserve"> = </w:t>
+      </w:r>
+      <w:proofErr w:type="gramStart"/>
+      <w:r>
+        <w:rPr>
+          <w:bCs/>
+          <w:color w:val="000000"/>
+        </w:rPr>
+        <w:t>float(input(</w:t>
+      </w:r>
+      <w:proofErr w:type="gramEnd"/>
+      <w:r>
+        <w:rPr>
+          <w:bCs/>
+          <w:color w:val="000000"/>
+        </w:rPr>
+        <w:t>"Enter the annual interest rate (in decimal): "))</w:t>
+      </w:r>
+    </w:p>
+    <w:p>
+      <w:pPr>
+        <w:spacing w:after="0" w:line="240" w:lineRule="auto"/>
+        <w:rPr>
+          <w:bCs/>
+          <w:color w:val="000000"/>
+        </w:rPr>
+      </w:pPr>
+      <w:r>
+        <w:rPr>
+          <w:bCs/>
+          <w:color w:val="000000"/>
+        </w:rPr>
+        <w:t xml:space="preserve">years = </w:t>
+      </w:r>
+      <w:proofErr w:type="gramStart"/>
+      <w:r>
+        <w:rPr>
+          <w:bCs/>
+          <w:color w:val="000000"/>
+        </w:rPr>
+        <w:t>int(input(</w:t>
+      </w:r>
+      <w:proofErr w:type="gramEnd"/>
+      <w:r>
+        <w:rPr>
+          <w:bCs/>
+          <w:color w:val="000000"/>
+        </w:rPr>
+        <w:t>"Enter the number of years: "))</w:t>
+      </w:r>
+    </w:p>
+    <w:p>
+      <w:pPr>
+        <w:spacing w:after="0" w:line="240" w:lineRule="auto"/>
+        <w:rPr>
+          <w:bCs/>
+          <w:color w:val="000000"/>
+        </w:rPr>
+      </w:pPr>
+    </w:p>
+    <w:p>
+      <w:pPr>
+        <w:spacing w:after="0" w:line="240" w:lineRule="auto"/>
+        <w:rPr>
+          <w:bCs/>
+          <w:color w:val="000000"/>
+        </w:rPr>
+      </w:pPr>
+      <w:proofErr w:type="spellStart"/>
+      <w:r>
+        <w:rPr>
+          <w:bCs/>
+          <w:color w:val="000000"/>
+        </w:rPr>
+        <w:t>final_amount</w:t>
+      </w:r>
+      <w:proofErr w:type="spellEnd"/>
+      <w:r>
+        <w:rPr>
+          <w:bCs/>
+          <w:color w:val="000000"/>
+        </w:rPr>
+        <w:t xml:space="preserve"> = deposit * </w:t>
+      </w:r>
+      <w:proofErr w:type="spellStart"/>
+      <w:proofErr w:type="gramStart"/>
+      <w:r>
+        <w:rPr>
+          <w:bCs/>
+          <w:color w:val="000000"/>
+        </w:rPr>
+        <w:t>math.pow</w:t>
+      </w:r>
+      <w:proofErr w:type="spellEnd"/>
+      <w:r>
+        <w:rPr>
+          <w:bCs/>
+          <w:color w:val="000000"/>
+        </w:rPr>
+        <w:t>(</w:t>
+      </w:r>
+      <w:proofErr w:type="gramEnd"/>
+      <w:r>
+        <w:rPr>
+          <w:bCs/>
+          <w:color w:val="000000"/>
+        </w:rPr>
+        <w:t xml:space="preserve">(1+ </w:t>
+      </w:r>
+      <w:proofErr w:type="spellStart"/>
+      <w:r>
+        <w:rPr>
+          <w:bCs/>
+          <w:color w:val="000000"/>
+        </w:rPr>
+        <w:t>interest_rate</w:t>
+      </w:r>
+      <w:proofErr w:type="spellEnd"/>
+      <w:r>
+        <w:rPr>
+          <w:bCs/>
+          <w:color w:val="000000"/>
+        </w:rPr>
+        <w:t>), years)</w:t>
+      </w:r>
+    </w:p>
+    <w:p>
+      <w:pPr>
+        <w:spacing w:after="0" w:line="240" w:lineRule="auto"/>
+        <w:rPr>
+          <w:bCs/>
+          <w:color w:val="000000"/>
+        </w:rPr>
+      </w:pPr>
+      <w:proofErr w:type="gramStart"/>
+      <w:r>
+        <w:rPr>
+          <w:bCs/>
+          <w:color w:val="000000"/>
+        </w:rPr>
+        <w:t>print(</w:t>
+      </w:r>
+      <w:proofErr w:type="spellStart"/>
+      <w:proofErr w:type="gramEnd"/>
+      <w:r>
+        <w:rPr>
+          <w:bCs/>
+          <w:color w:val="000000"/>
+        </w:rPr>
+        <w:t>f"The</w:t>
+      </w:r>
+      <w:proofErr w:type="spellEnd"/>
+      <w:r>
+        <w:rPr>
+          <w:bCs/>
+          <w:color w:val="000000"/>
+        </w:rPr>
+        <w:t xml:space="preserve"> final amount of the investment after {years} years is: {final_amount:.2f}")</w:t>
       </w:r>
     </w:p>
     <w:p>
@@ -2072,7 +2269,15 @@
         <w:t xml:space="preserve"> </w:t>
       </w:r>
       <w:r>
-        <w:t>x = (-b ± √(b² - 4ac)) / 2a</w:t>
+        <w:t xml:space="preserve">x = (-b ± </w:t>
+      </w:r>
+      <w:proofErr w:type="gramStart"/>
+      <w:r>
+        <w:t>√(</w:t>
+      </w:r>
+      <w:proofErr w:type="gramEnd"/>
+      <w:r>
+        <w:t>b² - 4ac)) / 2a</w:t>
       </w:r>
       <w:bookmarkEnd w:id="3"/>
     </w:p>
@@ -2203,55 +2408,125 @@
           <w:bCs/>
           <w:color w:val="000000"/>
         </w:rPr>
-        <w:t>    root1 = (-b + math.sqrt(discriminant)) / (2*a)</w:t>
-      </w:r>
-    </w:p>
-    <w:p>
-      <w:pPr>
-        <w:spacing w:after="0" w:line="240" w:lineRule="auto"/>
-        <w:rPr>
-          <w:bCs/>
-          <w:color w:val="000000"/>
-        </w:rPr>
-      </w:pPr>
-      <w:r>
-        <w:rPr>
-          <w:bCs/>
-          <w:color w:val="000000"/>
-        </w:rPr>
-        <w:t>    root2 = (-b - math.sqrt(discriminant)) / (2*a)</w:t>
-      </w:r>
-    </w:p>
-    <w:p>
-      <w:pPr>
-        <w:spacing w:after="0" w:line="240" w:lineRule="auto"/>
-        <w:rPr>
-          <w:bCs/>
-          <w:color w:val="000000"/>
-        </w:rPr>
-      </w:pPr>
-      <w:r>
-        <w:rPr>
-          <w:bCs/>
-          <w:color w:val="000000"/>
-        </w:rPr>
-        <w:t>    print(f"The roots are real and different: {root1} and {root2}")</w:t>
-      </w:r>
-    </w:p>
-    <w:p>
-      <w:pPr>
-        <w:spacing w:after="0" w:line="240" w:lineRule="auto"/>
-        <w:rPr>
-          <w:bCs/>
-          <w:color w:val="000000"/>
-        </w:rPr>
-      </w:pPr>
-      <w:r>
-        <w:rPr>
-          <w:bCs/>
-          <w:color w:val="000000"/>
-        </w:rPr>
-        <w:t>elif discriminant == 0:</w:t>
+        <w:t xml:space="preserve">    root1 = (-b + </w:t>
+      </w:r>
+      <w:proofErr w:type="spellStart"/>
+      <w:proofErr w:type="gramStart"/>
+      <w:r>
+        <w:rPr>
+          <w:bCs/>
+          <w:color w:val="000000"/>
+        </w:rPr>
+        <w:t>math.sqrt</w:t>
+      </w:r>
+      <w:proofErr w:type="spellEnd"/>
+      <w:proofErr w:type="gramEnd"/>
+      <w:r>
+        <w:rPr>
+          <w:bCs/>
+          <w:color w:val="000000"/>
+        </w:rPr>
+        <w:t>(discriminant)) / (2*a)</w:t>
+      </w:r>
+    </w:p>
+    <w:p>
+      <w:pPr>
+        <w:spacing w:after="0" w:line="240" w:lineRule="auto"/>
+        <w:rPr>
+          <w:bCs/>
+          <w:color w:val="000000"/>
+        </w:rPr>
+      </w:pPr>
+      <w:r>
+        <w:rPr>
+          <w:bCs/>
+          <w:color w:val="000000"/>
+        </w:rPr>
+        <w:t xml:space="preserve">    root2 = (-b - </w:t>
+      </w:r>
+      <w:proofErr w:type="spellStart"/>
+      <w:proofErr w:type="gramStart"/>
+      <w:r>
+        <w:rPr>
+          <w:bCs/>
+          <w:color w:val="000000"/>
+        </w:rPr>
+        <w:t>math.sqrt</w:t>
+      </w:r>
+      <w:proofErr w:type="spellEnd"/>
+      <w:proofErr w:type="gramEnd"/>
+      <w:r>
+        <w:rPr>
+          <w:bCs/>
+          <w:color w:val="000000"/>
+        </w:rPr>
+        <w:t>(discriminant)) / (2*a)</w:t>
+      </w:r>
+    </w:p>
+    <w:p>
+      <w:pPr>
+        <w:spacing w:after="0" w:line="240" w:lineRule="auto"/>
+        <w:rPr>
+          <w:bCs/>
+          <w:color w:val="000000"/>
+        </w:rPr>
+      </w:pPr>
+      <w:r>
+        <w:rPr>
+          <w:bCs/>
+          <w:color w:val="000000"/>
+        </w:rPr>
+        <w:t xml:space="preserve">    </w:t>
+      </w:r>
+      <w:proofErr w:type="gramStart"/>
+      <w:r>
+        <w:rPr>
+          <w:bCs/>
+          <w:color w:val="000000"/>
+        </w:rPr>
+        <w:t>print(</w:t>
+      </w:r>
+      <w:proofErr w:type="spellStart"/>
+      <w:proofErr w:type="gramEnd"/>
+      <w:r>
+        <w:rPr>
+          <w:bCs/>
+          <w:color w:val="000000"/>
+        </w:rPr>
+        <w:t>f"The</w:t>
+      </w:r>
+      <w:proofErr w:type="spellEnd"/>
+      <w:r>
+        <w:rPr>
+          <w:bCs/>
+          <w:color w:val="000000"/>
+        </w:rPr>
+        <w:t xml:space="preserve"> roots are real and different: {root1} and {root2}")</w:t>
+      </w:r>
+    </w:p>
+    <w:p>
+      <w:pPr>
+        <w:spacing w:after="0" w:line="240" w:lineRule="auto"/>
+        <w:rPr>
+          <w:bCs/>
+          <w:color w:val="000000"/>
+        </w:rPr>
+      </w:pPr>
+      <w:proofErr w:type="spellStart"/>
+      <w:r>
+        <w:rPr>
+          <w:bCs/>
+          <w:color w:val="000000"/>
+        </w:rPr>
+        <w:t>elif</w:t>
+      </w:r>
+      <w:proofErr w:type="spellEnd"/>
+      <w:r>
+        <w:rPr>
+          <w:bCs/>
+          <w:color w:val="000000"/>
+        </w:rPr>
+        <w:t xml:space="preserve"> discriminant == 0:</w:t>
       </w:r>
     </w:p>
     <w:p>
@@ -2283,7 +2558,32 @@
           <w:bCs/>
           <w:color w:val="000000"/>
         </w:rPr>
-        <w:t>    print(f"The roots are real and the same: {root}")</w:t>
+        <w:t xml:space="preserve">    </w:t>
+      </w:r>
+      <w:proofErr w:type="gramStart"/>
+      <w:r>
+        <w:rPr>
+          <w:bCs/>
+          <w:color w:val="000000"/>
+        </w:rPr>
+        <w:t>print(</w:t>
+      </w:r>
+      <w:proofErr w:type="spellStart"/>
+      <w:proofErr w:type="gramEnd"/>
+      <w:r>
+        <w:rPr>
+          <w:bCs/>
+          <w:color w:val="000000"/>
+        </w:rPr>
+        <w:t>f"The</w:t>
+      </w:r>
+      <w:proofErr w:type="spellEnd"/>
+      <w:r>
+        <w:rPr>
+          <w:bCs/>
+          <w:color w:val="000000"/>
+        </w:rPr>
+        <w:t xml:space="preserve"> roots are real and the same: {root}")</w:t>
       </w:r>
     </w:p>
     <w:p>
@@ -2315,39 +2615,228 @@
           <w:bCs/>
           <w:color w:val="000000"/>
         </w:rPr>
-        <w:t>    real_part = -b / (2*a)</w:t>
-      </w:r>
-    </w:p>
-    <w:p>
-      <w:pPr>
-        <w:spacing w:after="0" w:line="240" w:lineRule="auto"/>
-        <w:rPr>
-          <w:bCs/>
-          <w:color w:val="000000"/>
-        </w:rPr>
-      </w:pPr>
-      <w:r>
-        <w:rPr>
-          <w:bCs/>
-          <w:color w:val="000000"/>
-        </w:rPr>
-        <w:t>    imaginary_part = math.sqrt(-discriminant) / (2*a)</w:t>
-      </w:r>
-    </w:p>
-    <w:p>
-      <w:pPr>
-        <w:spacing w:after="0" w:line="240" w:lineRule="auto"/>
-        <w:rPr>
-          <w:bCs/>
-          <w:color w:val="000000"/>
-        </w:rPr>
-      </w:pPr>
-      <w:r>
-        <w:rPr>
-          <w:bCs/>
-          <w:color w:val="000000"/>
-        </w:rPr>
-        <w:t>    print(f"The roots are complex: {real_part} + {imaginary_part}i and {real_part} - {imaginary_part}i")</w:t>
+        <w:t xml:space="preserve">    </w:t>
+      </w:r>
+      <w:proofErr w:type="spellStart"/>
+      <w:r>
+        <w:rPr>
+          <w:bCs/>
+          <w:color w:val="000000"/>
+        </w:rPr>
+        <w:t>real_part</w:t>
+      </w:r>
+      <w:proofErr w:type="spellEnd"/>
+      <w:r>
+        <w:rPr>
+          <w:bCs/>
+          <w:color w:val="000000"/>
+        </w:rPr>
+        <w:t xml:space="preserve"> = -b / (2*a)</w:t>
+      </w:r>
+    </w:p>
+    <w:p>
+      <w:pPr>
+        <w:spacing w:after="0" w:line="240" w:lineRule="auto"/>
+        <w:rPr>
+          <w:bCs/>
+          <w:color w:val="000000"/>
+        </w:rPr>
+      </w:pPr>
+      <w:r>
+        <w:rPr>
+          <w:bCs/>
+          <w:color w:val="000000"/>
+        </w:rPr>
+        <w:t xml:space="preserve">    </w:t>
+      </w:r>
+      <w:proofErr w:type="spellStart"/>
+      <w:r>
+        <w:rPr>
+          <w:bCs/>
+          <w:color w:val="000000"/>
+        </w:rPr>
+        <w:t>imaginary_part</w:t>
+      </w:r>
+      <w:proofErr w:type="spellEnd"/>
+      <w:r>
+        <w:rPr>
+          <w:bCs/>
+          <w:color w:val="000000"/>
+        </w:rPr>
+        <w:t xml:space="preserve"> = </w:t>
+      </w:r>
+      <w:proofErr w:type="spellStart"/>
+      <w:proofErr w:type="gramStart"/>
+      <w:r>
+        <w:rPr>
+          <w:bCs/>
+          <w:color w:val="000000"/>
+        </w:rPr>
+        <w:t>math.sqrt</w:t>
+      </w:r>
+      <w:proofErr w:type="spellEnd"/>
+      <w:proofErr w:type="gramEnd"/>
+      <w:r>
+        <w:rPr>
+          <w:bCs/>
+          <w:color w:val="000000"/>
+        </w:rPr>
+        <w:t>(-discriminant) / (2*a)</w:t>
+      </w:r>
+    </w:p>
+    <w:p>
+      <w:pPr>
+        <w:spacing w:after="0" w:line="240" w:lineRule="auto"/>
+        <w:rPr>
+          <w:bCs/>
+          <w:color w:val="000000"/>
+        </w:rPr>
+      </w:pPr>
+      <w:r>
+        <w:rPr>
+          <w:bCs/>
+          <w:color w:val="000000"/>
+        </w:rPr>
+        <w:t xml:space="preserve">    </w:t>
+      </w:r>
+      <w:proofErr w:type="gramStart"/>
+      <w:r>
+        <w:rPr>
+          <w:bCs/>
+          <w:color w:val="000000"/>
+        </w:rPr>
+        <w:t>print(</w:t>
+      </w:r>
+      <w:proofErr w:type="spellStart"/>
+      <w:proofErr w:type="gramEnd"/>
+      <w:r>
+        <w:rPr>
+          <w:bCs/>
+          <w:color w:val="000000"/>
+        </w:rPr>
+        <w:t>f"The</w:t>
+      </w:r>
+      <w:proofErr w:type="spellEnd"/>
+      <w:r>
+        <w:rPr>
+          <w:bCs/>
+          <w:color w:val="000000"/>
+        </w:rPr>
+        <w:t xml:space="preserve"> roots are complex: {</w:t>
+      </w:r>
+      <w:proofErr w:type="spellStart"/>
+      <w:r>
+        <w:rPr>
+          <w:bCs/>
+          <w:color w:val="000000"/>
+        </w:rPr>
+        <w:t>real_part</w:t>
+      </w:r>
+      <w:proofErr w:type="spellEnd"/>
+      <w:r>
+        <w:rPr>
+          <w:bCs/>
+          <w:color w:val="000000"/>
+        </w:rPr>
+        <w:t>} + {</w:t>
+      </w:r>
+      <w:proofErr w:type="spellStart"/>
+      <w:r>
+        <w:rPr>
+          <w:bCs/>
+          <w:color w:val="000000"/>
+        </w:rPr>
+        <w:t>imaginary_</w:t>
+      </w:r>
+      <w:proofErr w:type="gramStart"/>
+      <w:r>
+        <w:rPr>
+          <w:bCs/>
+          <w:color w:val="000000"/>
+        </w:rPr>
+        <w:t>part</w:t>
+      </w:r>
+      <w:proofErr w:type="spellEnd"/>
+      <w:r>
+        <w:rPr>
+          <w:bCs/>
+          <w:color w:val="000000"/>
+        </w:rPr>
+        <w:t>}</w:t>
+      </w:r>
+      <w:proofErr w:type="spellStart"/>
+      <w:r>
+        <w:rPr>
+          <w:bCs/>
+          <w:color w:val="000000"/>
+        </w:rPr>
+        <w:t>i</w:t>
+      </w:r>
+      <w:proofErr w:type="spellEnd"/>
+      <w:proofErr w:type="gramEnd"/>
+      <w:r>
+        <w:rPr>
+          <w:bCs/>
+          <w:color w:val="000000"/>
+        </w:rPr>
+        <w:t xml:space="preserve"> and {</w:t>
+      </w:r>
+      <w:proofErr w:type="spellStart"/>
+      <w:r>
+        <w:rPr>
+          <w:bCs/>
+          <w:color w:val="000000"/>
+        </w:rPr>
+        <w:t>real_part</w:t>
+      </w:r>
+      <w:proofErr w:type="spellEnd"/>
+      <w:r>
+        <w:rPr>
+          <w:bCs/>
+          <w:color w:val="000000"/>
+        </w:rPr>
+        <w:t>} - {</w:t>
+      </w:r>
+      <w:proofErr w:type="spellStart"/>
+      <w:r>
+        <w:rPr>
+          <w:bCs/>
+          <w:color w:val="000000"/>
+        </w:rPr>
+        <w:t>imaginary_</w:t>
+      </w:r>
+      <w:proofErr w:type="gramStart"/>
+      <w:r>
+        <w:rPr>
+          <w:bCs/>
+          <w:color w:val="000000"/>
+        </w:rPr>
+        <w:t>part</w:t>
+      </w:r>
+      <w:proofErr w:type="spellEnd"/>
+      <w:r>
+        <w:rPr>
+          <w:bCs/>
+          <w:color w:val="000000"/>
+        </w:rPr>
+        <w:t>}</w:t>
+      </w:r>
+      <w:proofErr w:type="spellStart"/>
+      <w:r>
+        <w:rPr>
+          <w:bCs/>
+          <w:color w:val="000000"/>
+        </w:rPr>
+        <w:t>i</w:t>
+      </w:r>
+      <w:proofErr w:type="spellEnd"/>
+      <w:proofErr w:type="gramEnd"/>
+      <w:r>
+        <w:rPr>
+          <w:bCs/>
+          <w:color w:val="000000"/>
+        </w:rPr>
+        <w:t>")</w:t>
       </w:r>
     </w:p>
     <w:p>
@@ -2515,7 +3004,23 @@
           <w:bCs/>
           <w:color w:val="000000"/>
         </w:rPr>
-        <w:t>gender = input("Enter your gender: ")</w:t>
+        <w:t xml:space="preserve">gender = </w:t>
+      </w:r>
+      <w:proofErr w:type="gramStart"/>
+      <w:r>
+        <w:rPr>
+          <w:bCs/>
+          <w:color w:val="000000"/>
+        </w:rPr>
+        <w:t>input(</w:t>
+      </w:r>
+      <w:proofErr w:type="gramEnd"/>
+      <w:r>
+        <w:rPr>
+          <w:bCs/>
+          <w:color w:val="000000"/>
+        </w:rPr>
+        <w:t>"Enter your gender: ")</w:t>
       </w:r>
     </w:p>
     <w:p>
@@ -2556,39 +3061,80 @@
           <w:bCs/>
           <w:color w:val="000000"/>
         </w:rPr>
-        <w:t>    print("Good Morning Sir.")</w:t>
-      </w:r>
-    </w:p>
-    <w:p>
-      <w:pPr>
-        <w:spacing w:after="0" w:line="240" w:lineRule="auto"/>
-        <w:rPr>
-          <w:bCs/>
-          <w:color w:val="000000"/>
-        </w:rPr>
-      </w:pPr>
-      <w:r>
-        <w:rPr>
-          <w:bCs/>
-          <w:color w:val="000000"/>
-        </w:rPr>
-        <w:t>elif gender == "female":</w:t>
-      </w:r>
-    </w:p>
-    <w:p>
-      <w:pPr>
-        <w:spacing w:after="0" w:line="240" w:lineRule="auto"/>
-        <w:rPr>
-          <w:bCs/>
-          <w:color w:val="000000"/>
-        </w:rPr>
-      </w:pPr>
-      <w:r>
-        <w:rPr>
-          <w:bCs/>
-          <w:color w:val="000000"/>
-        </w:rPr>
-        <w:t>    print("Good Morning Ma’am.")</w:t>
+        <w:t xml:space="preserve">    </w:t>
+      </w:r>
+      <w:proofErr w:type="gramStart"/>
+      <w:r>
+        <w:rPr>
+          <w:bCs/>
+          <w:color w:val="000000"/>
+        </w:rPr>
+        <w:t>print(</w:t>
+      </w:r>
+      <w:proofErr w:type="gramEnd"/>
+      <w:r>
+        <w:rPr>
+          <w:bCs/>
+          <w:color w:val="000000"/>
+        </w:rPr>
+        <w:t>"Good Morning Sir.")</w:t>
+      </w:r>
+    </w:p>
+    <w:p>
+      <w:pPr>
+        <w:spacing w:after="0" w:line="240" w:lineRule="auto"/>
+        <w:rPr>
+          <w:bCs/>
+          <w:color w:val="000000"/>
+        </w:rPr>
+      </w:pPr>
+      <w:proofErr w:type="spellStart"/>
+      <w:r>
+        <w:rPr>
+          <w:bCs/>
+          <w:color w:val="000000"/>
+        </w:rPr>
+        <w:t>elif</w:t>
+      </w:r>
+      <w:proofErr w:type="spellEnd"/>
+      <w:r>
+        <w:rPr>
+          <w:bCs/>
+          <w:color w:val="000000"/>
+        </w:rPr>
+        <w:t xml:space="preserve"> gender == "female":</w:t>
+      </w:r>
+    </w:p>
+    <w:p>
+      <w:pPr>
+        <w:spacing w:after="0" w:line="240" w:lineRule="auto"/>
+        <w:rPr>
+          <w:bCs/>
+          <w:color w:val="000000"/>
+        </w:rPr>
+      </w:pPr>
+      <w:r>
+        <w:rPr>
+          <w:bCs/>
+          <w:color w:val="000000"/>
+        </w:rPr>
+        <w:t xml:space="preserve">    </w:t>
+      </w:r>
+      <w:proofErr w:type="gramStart"/>
+      <w:r>
+        <w:rPr>
+          <w:bCs/>
+          <w:color w:val="000000"/>
+        </w:rPr>
+        <w:t>print(</w:t>
+      </w:r>
+      <w:proofErr w:type="gramEnd"/>
+      <w:r>
+        <w:rPr>
+          <w:bCs/>
+          <w:color w:val="000000"/>
+        </w:rPr>
+        <w:t>"Good Morning Ma’am.")</w:t>
       </w:r>
     </w:p>
     <w:p>
@@ -2620,7 +3166,23 @@
           <w:bCs/>
           <w:color w:val="000000"/>
         </w:rPr>
-        <w:t>    print("Invalid input. Please enter only male or female.")</w:t>
+        <w:t xml:space="preserve">    </w:t>
+      </w:r>
+      <w:proofErr w:type="gramStart"/>
+      <w:r>
+        <w:rPr>
+          <w:bCs/>
+          <w:color w:val="000000"/>
+        </w:rPr>
+        <w:t>print(</w:t>
+      </w:r>
+      <w:proofErr w:type="gramEnd"/>
+      <w:r>
+        <w:rPr>
+          <w:bCs/>
+          <w:color w:val="000000"/>
+        </w:rPr>
+        <w:t>"Invalid input. Please enter only male or female.")</w:t>
       </w:r>
     </w:p>
     <w:p>
@@ -2905,108 +3467,263 @@
           <w:color w:val="000000"/>
         </w:rPr>
       </w:pPr>
-      <w:r>
-        <w:rPr>
-          <w:bCs/>
-          <w:color w:val="000000"/>
-        </w:rPr>
-        <w:t>signal_color = input("Enter the color of the traffic signal (RED, YELLOW, GREEN): ").upper()</w:t>
-      </w:r>
-    </w:p>
-    <w:p>
-      <w:pPr>
-        <w:spacing w:after="0" w:line="240" w:lineRule="auto"/>
-        <w:rPr>
-          <w:bCs/>
-          <w:color w:val="000000"/>
-        </w:rPr>
-      </w:pPr>
-      <w:r>
-        <w:rPr>
-          <w:bCs/>
-          <w:color w:val="000000"/>
-        </w:rPr>
-        <w:t>if signal_color == "RED":</w:t>
-      </w:r>
-    </w:p>
-    <w:p>
-      <w:pPr>
-        <w:spacing w:after="0" w:line="240" w:lineRule="auto"/>
-        <w:rPr>
-          <w:bCs/>
-          <w:color w:val="000000"/>
-        </w:rPr>
-      </w:pPr>
-      <w:r>
-        <w:rPr>
-          <w:bCs/>
-          <w:color w:val="000000"/>
-        </w:rPr>
-        <w:t>    print("Vehicle must stop")</w:t>
-      </w:r>
-    </w:p>
-    <w:p>
-      <w:pPr>
-        <w:spacing w:after="0" w:line="240" w:lineRule="auto"/>
-        <w:rPr>
-          <w:bCs/>
-          <w:color w:val="000000"/>
-        </w:rPr>
-      </w:pPr>
-      <w:r>
-        <w:rPr>
-          <w:bCs/>
-          <w:color w:val="000000"/>
-        </w:rPr>
-        <w:t>elif signal_color == "YELLOW":</w:t>
-      </w:r>
-    </w:p>
-    <w:p>
-      <w:pPr>
-        <w:spacing w:after="0" w:line="240" w:lineRule="auto"/>
-        <w:rPr>
-          <w:bCs/>
-          <w:color w:val="000000"/>
-        </w:rPr>
-      </w:pPr>
-      <w:r>
-        <w:rPr>
-          <w:bCs/>
-          <w:color w:val="000000"/>
-        </w:rPr>
-        <w:t>    print("Vehicles should get ready to move")</w:t>
-      </w:r>
-    </w:p>
-    <w:p>
-      <w:pPr>
-        <w:spacing w:after="0" w:line="240" w:lineRule="auto"/>
-        <w:rPr>
-          <w:bCs/>
-          <w:color w:val="000000"/>
-        </w:rPr>
-      </w:pPr>
-      <w:r>
-        <w:rPr>
-          <w:bCs/>
-          <w:color w:val="000000"/>
-        </w:rPr>
-        <w:t>elif signal_color == "GREEN":</w:t>
-      </w:r>
-    </w:p>
-    <w:p>
-      <w:pPr>
-        <w:spacing w:after="0" w:line="240" w:lineRule="auto"/>
-        <w:rPr>
-          <w:bCs/>
-          <w:color w:val="000000"/>
-        </w:rPr>
-      </w:pPr>
-      <w:r>
-        <w:rPr>
-          <w:bCs/>
-          <w:color w:val="000000"/>
-        </w:rPr>
-        <w:t>    print("Vehicles can move now")</w:t>
+      <w:proofErr w:type="spellStart"/>
+      <w:r>
+        <w:rPr>
+          <w:bCs/>
+          <w:color w:val="000000"/>
+        </w:rPr>
+        <w:t>signal_color</w:t>
+      </w:r>
+      <w:proofErr w:type="spellEnd"/>
+      <w:r>
+        <w:rPr>
+          <w:bCs/>
+          <w:color w:val="000000"/>
+        </w:rPr>
+        <w:t xml:space="preserve"> = </w:t>
+      </w:r>
+      <w:proofErr w:type="gramStart"/>
+      <w:r>
+        <w:rPr>
+          <w:bCs/>
+          <w:color w:val="000000"/>
+        </w:rPr>
+        <w:t>input(</w:t>
+      </w:r>
+      <w:proofErr w:type="gramEnd"/>
+      <w:r>
+        <w:rPr>
+          <w:bCs/>
+          <w:color w:val="000000"/>
+        </w:rPr>
+        <w:t>"Enter the color of the traffic signal (RED, YELLOW, GREEN): "</w:t>
+      </w:r>
+      <w:proofErr w:type="gramStart"/>
+      <w:r>
+        <w:rPr>
+          <w:bCs/>
+          <w:color w:val="000000"/>
+        </w:rPr>
+        <w:t>).upper</w:t>
+      </w:r>
+      <w:proofErr w:type="gramEnd"/>
+      <w:r>
+        <w:rPr>
+          <w:bCs/>
+          <w:color w:val="000000"/>
+        </w:rPr>
+        <w:t>()</w:t>
+      </w:r>
+    </w:p>
+    <w:p>
+      <w:pPr>
+        <w:spacing w:after="0" w:line="240" w:lineRule="auto"/>
+        <w:rPr>
+          <w:bCs/>
+          <w:color w:val="000000"/>
+        </w:rPr>
+      </w:pPr>
+      <w:r>
+        <w:rPr>
+          <w:bCs/>
+          <w:color w:val="000000"/>
+        </w:rPr>
+        <w:t xml:space="preserve">if </w:t>
+      </w:r>
+      <w:proofErr w:type="spellStart"/>
+      <w:r>
+        <w:rPr>
+          <w:bCs/>
+          <w:color w:val="000000"/>
+        </w:rPr>
+        <w:t>signal_color</w:t>
+      </w:r>
+      <w:proofErr w:type="spellEnd"/>
+      <w:r>
+        <w:rPr>
+          <w:bCs/>
+          <w:color w:val="000000"/>
+        </w:rPr>
+        <w:t xml:space="preserve"> == "RED":</w:t>
+      </w:r>
+    </w:p>
+    <w:p>
+      <w:pPr>
+        <w:spacing w:after="0" w:line="240" w:lineRule="auto"/>
+        <w:rPr>
+          <w:bCs/>
+          <w:color w:val="000000"/>
+        </w:rPr>
+      </w:pPr>
+      <w:r>
+        <w:rPr>
+          <w:bCs/>
+          <w:color w:val="000000"/>
+        </w:rPr>
+        <w:t xml:space="preserve">    </w:t>
+      </w:r>
+      <w:proofErr w:type="gramStart"/>
+      <w:r>
+        <w:rPr>
+          <w:bCs/>
+          <w:color w:val="000000"/>
+        </w:rPr>
+        <w:t>print(</w:t>
+      </w:r>
+      <w:proofErr w:type="gramEnd"/>
+      <w:r>
+        <w:rPr>
+          <w:bCs/>
+          <w:color w:val="000000"/>
+        </w:rPr>
+        <w:t>"Vehicle must stop")</w:t>
+      </w:r>
+    </w:p>
+    <w:p>
+      <w:pPr>
+        <w:spacing w:after="0" w:line="240" w:lineRule="auto"/>
+        <w:rPr>
+          <w:bCs/>
+          <w:color w:val="000000"/>
+        </w:rPr>
+      </w:pPr>
+      <w:proofErr w:type="spellStart"/>
+      <w:r>
+        <w:rPr>
+          <w:bCs/>
+          <w:color w:val="000000"/>
+        </w:rPr>
+        <w:t>elif</w:t>
+      </w:r>
+      <w:proofErr w:type="spellEnd"/>
+      <w:r>
+        <w:rPr>
+          <w:bCs/>
+          <w:color w:val="000000"/>
+        </w:rPr>
+        <w:t xml:space="preserve"> </w:t>
+      </w:r>
+      <w:proofErr w:type="spellStart"/>
+      <w:r>
+        <w:rPr>
+          <w:bCs/>
+          <w:color w:val="000000"/>
+        </w:rPr>
+        <w:t>signal_color</w:t>
+      </w:r>
+      <w:proofErr w:type="spellEnd"/>
+      <w:r>
+        <w:rPr>
+          <w:bCs/>
+          <w:color w:val="000000"/>
+        </w:rPr>
+        <w:t xml:space="preserve"> == "YELLOW":</w:t>
+      </w:r>
+    </w:p>
+    <w:p>
+      <w:pPr>
+        <w:spacing w:after="0" w:line="240" w:lineRule="auto"/>
+        <w:rPr>
+          <w:bCs/>
+          <w:color w:val="000000"/>
+        </w:rPr>
+      </w:pPr>
+      <w:r>
+        <w:rPr>
+          <w:bCs/>
+          <w:color w:val="000000"/>
+        </w:rPr>
+        <w:t xml:space="preserve">    </w:t>
+      </w:r>
+      <w:proofErr w:type="gramStart"/>
+      <w:r>
+        <w:rPr>
+          <w:bCs/>
+          <w:color w:val="000000"/>
+        </w:rPr>
+        <w:t>print(</w:t>
+      </w:r>
+      <w:proofErr w:type="gramEnd"/>
+      <w:r>
+        <w:rPr>
+          <w:bCs/>
+          <w:color w:val="000000"/>
+        </w:rPr>
+        <w:t>"Vehicles should get ready to move")</w:t>
+      </w:r>
+    </w:p>
+    <w:p>
+      <w:pPr>
+        <w:spacing w:after="0" w:line="240" w:lineRule="auto"/>
+        <w:rPr>
+          <w:bCs/>
+          <w:color w:val="000000"/>
+        </w:rPr>
+      </w:pPr>
+      <w:proofErr w:type="spellStart"/>
+      <w:r>
+        <w:rPr>
+          <w:bCs/>
+          <w:color w:val="000000"/>
+        </w:rPr>
+        <w:t>elif</w:t>
+      </w:r>
+      <w:proofErr w:type="spellEnd"/>
+      <w:r>
+        <w:rPr>
+          <w:bCs/>
+          <w:color w:val="000000"/>
+        </w:rPr>
+        <w:t xml:space="preserve"> </w:t>
+      </w:r>
+      <w:proofErr w:type="spellStart"/>
+      <w:r>
+        <w:rPr>
+          <w:bCs/>
+          <w:color w:val="000000"/>
+        </w:rPr>
+        <w:t>signal_color</w:t>
+      </w:r>
+      <w:proofErr w:type="spellEnd"/>
+      <w:r>
+        <w:rPr>
+          <w:bCs/>
+          <w:color w:val="000000"/>
+        </w:rPr>
+        <w:t xml:space="preserve"> == "GREEN":</w:t>
+      </w:r>
+    </w:p>
+    <w:p>
+      <w:pPr>
+        <w:spacing w:after="0" w:line="240" w:lineRule="auto"/>
+        <w:rPr>
+          <w:bCs/>
+          <w:color w:val="000000"/>
+        </w:rPr>
+      </w:pPr>
+      <w:r>
+        <w:rPr>
+          <w:bCs/>
+          <w:color w:val="000000"/>
+        </w:rPr>
+        <w:t xml:space="preserve">    </w:t>
+      </w:r>
+      <w:proofErr w:type="gramStart"/>
+      <w:r>
+        <w:rPr>
+          <w:bCs/>
+          <w:color w:val="000000"/>
+        </w:rPr>
+        <w:t>print(</w:t>
+      </w:r>
+      <w:proofErr w:type="gramEnd"/>
+      <w:r>
+        <w:rPr>
+          <w:bCs/>
+          <w:color w:val="000000"/>
+        </w:rPr>
+        <w:t>"Vehicles can move now")</w:t>
       </w:r>
     </w:p>
     <w:p>
@@ -3038,7 +3755,23 @@
           <w:bCs/>
           <w:color w:val="000000"/>
         </w:rPr>
-        <w:t>    print("Invalid input. Please enter RED, YELLOW, or GREEN.")</w:t>
+        <w:t xml:space="preserve">    </w:t>
+      </w:r>
+      <w:proofErr w:type="gramStart"/>
+      <w:r>
+        <w:rPr>
+          <w:bCs/>
+          <w:color w:val="000000"/>
+        </w:rPr>
+        <w:t>print(</w:t>
+      </w:r>
+      <w:proofErr w:type="gramEnd"/>
+      <w:r>
+        <w:rPr>
+          <w:bCs/>
+          <w:color w:val="000000"/>
+        </w:rPr>
+        <w:t>"Invalid input. Please enter RED, YELLOW, or GREEN.")</w:t>
       </w:r>
     </w:p>
     <w:p>
@@ -3267,7 +4000,28 @@
         <w:t xml:space="preserve">6. </w:t>
       </w:r>
       <w:r>
-        <w:t>Write a program that takes user input day name. If the day is Monday, Tuesday, Wednesday, Thursday or Friday, then show “It’s a week day”. If the day is Saturday then show “It’s weekend”. If the day is  sunday then show “Yay! It’s a holiday”.</w:t>
+        <w:t xml:space="preserve">Write a program that takes user input day name. If the day is Monday, Tuesday, Wednesday, Thursday or Friday, then show “It’s a week day”. If the day is </w:t>
+      </w:r>
+      <w:proofErr w:type="gramStart"/>
+      <w:r>
+        <w:t>Saturday</w:t>
+      </w:r>
+      <w:proofErr w:type="gramEnd"/>
+      <w:r>
+        <w:t xml:space="preserve"> then show “It’s weekend”. If the day </w:t>
+      </w:r>
+      <w:proofErr w:type="gramStart"/>
+      <w:r>
+        <w:t>is  </w:t>
+      </w:r>
+      <w:proofErr w:type="spellStart"/>
+      <w:r>
+        <w:t>sunday</w:t>
+      </w:r>
+      <w:proofErr w:type="spellEnd"/>
+      <w:proofErr w:type="gramEnd"/>
+      <w:r>
+        <w:t xml:space="preserve"> then show “Yay! It’s a holiday”.</w:t>
       </w:r>
       <w:bookmarkEnd w:id="6"/>
     </w:p>
@@ -3293,7 +4047,39 @@
           <w:bCs/>
           <w:color w:val="000000"/>
         </w:rPr>
-        <w:t>day = input("Enter the day name: ").upper()</w:t>
+        <w:t xml:space="preserve">day = </w:t>
+      </w:r>
+      <w:proofErr w:type="gramStart"/>
+      <w:r>
+        <w:rPr>
+          <w:bCs/>
+          <w:color w:val="000000"/>
+        </w:rPr>
+        <w:t>input(</w:t>
+      </w:r>
+      <w:proofErr w:type="gramEnd"/>
+      <w:r>
+        <w:rPr>
+          <w:bCs/>
+          <w:color w:val="000000"/>
+        </w:rPr>
+        <w:t>"Enter the day name: "</w:t>
+      </w:r>
+      <w:proofErr w:type="gramStart"/>
+      <w:r>
+        <w:rPr>
+          <w:bCs/>
+          <w:color w:val="000000"/>
+        </w:rPr>
+        <w:t>).upper</w:t>
+      </w:r>
+      <w:proofErr w:type="gramEnd"/>
+      <w:r>
+        <w:rPr>
+          <w:bCs/>
+          <w:color w:val="000000"/>
+        </w:rPr>
+        <w:t>()</w:t>
       </w:r>
     </w:p>
     <w:p>
@@ -3341,71 +4127,137 @@
           <w:bCs/>
           <w:color w:val="000000"/>
         </w:rPr>
-        <w:t>    print("It's a week day")</w:t>
-      </w:r>
-    </w:p>
-    <w:p>
-      <w:pPr>
-        <w:spacing w:after="0" w:line="240" w:lineRule="auto"/>
-        <w:rPr>
-          <w:bCs/>
-          <w:color w:val="000000"/>
-        </w:rPr>
-      </w:pPr>
-      <w:r>
-        <w:rPr>
-          <w:bCs/>
-          <w:color w:val="000000"/>
-        </w:rPr>
-        <w:t>elif day == "SATURDAY":</w:t>
-      </w:r>
-    </w:p>
-    <w:p>
-      <w:pPr>
-        <w:spacing w:after="0" w:line="240" w:lineRule="auto"/>
-        <w:rPr>
-          <w:bCs/>
-          <w:color w:val="000000"/>
-        </w:rPr>
-      </w:pPr>
-      <w:r>
-        <w:rPr>
-          <w:bCs/>
-          <w:color w:val="000000"/>
-        </w:rPr>
-        <w:t>    print("It's weekend")</w:t>
-      </w:r>
-    </w:p>
-    <w:p>
-      <w:pPr>
-        <w:spacing w:after="0" w:line="240" w:lineRule="auto"/>
-        <w:rPr>
-          <w:bCs/>
-          <w:color w:val="000000"/>
-        </w:rPr>
-      </w:pPr>
-      <w:r>
-        <w:rPr>
-          <w:bCs/>
-          <w:color w:val="000000"/>
-        </w:rPr>
-        <w:t>elif day == "SUNDAY":</w:t>
-      </w:r>
-    </w:p>
-    <w:p>
-      <w:pPr>
-        <w:spacing w:after="0" w:line="240" w:lineRule="auto"/>
-        <w:rPr>
-          <w:bCs/>
-          <w:color w:val="000000"/>
-        </w:rPr>
-      </w:pPr>
-      <w:r>
-        <w:rPr>
-          <w:bCs/>
-          <w:color w:val="000000"/>
-        </w:rPr>
-        <w:t>    print("Yay! It's a holiday")</w:t>
+        <w:t xml:space="preserve">    </w:t>
+      </w:r>
+      <w:proofErr w:type="gramStart"/>
+      <w:r>
+        <w:rPr>
+          <w:bCs/>
+          <w:color w:val="000000"/>
+        </w:rPr>
+        <w:t>print(</w:t>
+      </w:r>
+      <w:proofErr w:type="gramEnd"/>
+      <w:r>
+        <w:rPr>
+          <w:bCs/>
+          <w:color w:val="000000"/>
+        </w:rPr>
+        <w:t>"It's a week day")</w:t>
+      </w:r>
+    </w:p>
+    <w:p>
+      <w:pPr>
+        <w:spacing w:after="0" w:line="240" w:lineRule="auto"/>
+        <w:rPr>
+          <w:bCs/>
+          <w:color w:val="000000"/>
+        </w:rPr>
+      </w:pPr>
+      <w:proofErr w:type="spellStart"/>
+      <w:r>
+        <w:rPr>
+          <w:bCs/>
+          <w:color w:val="000000"/>
+        </w:rPr>
+        <w:t>elif</w:t>
+      </w:r>
+      <w:proofErr w:type="spellEnd"/>
+      <w:r>
+        <w:rPr>
+          <w:bCs/>
+          <w:color w:val="000000"/>
+        </w:rPr>
+        <w:t xml:space="preserve"> day == "SATURDAY":</w:t>
+      </w:r>
+    </w:p>
+    <w:p>
+      <w:pPr>
+        <w:spacing w:after="0" w:line="240" w:lineRule="auto"/>
+        <w:rPr>
+          <w:bCs/>
+          <w:color w:val="000000"/>
+        </w:rPr>
+      </w:pPr>
+      <w:r>
+        <w:rPr>
+          <w:bCs/>
+          <w:color w:val="000000"/>
+        </w:rPr>
+        <w:t xml:space="preserve">    </w:t>
+      </w:r>
+      <w:proofErr w:type="gramStart"/>
+      <w:r>
+        <w:rPr>
+          <w:bCs/>
+          <w:color w:val="000000"/>
+        </w:rPr>
+        <w:t>print(</w:t>
+      </w:r>
+      <w:proofErr w:type="gramEnd"/>
+      <w:r>
+        <w:rPr>
+          <w:bCs/>
+          <w:color w:val="000000"/>
+        </w:rPr>
+        <w:t>"It's weekend")</w:t>
+      </w:r>
+    </w:p>
+    <w:p>
+      <w:pPr>
+        <w:spacing w:after="0" w:line="240" w:lineRule="auto"/>
+        <w:rPr>
+          <w:bCs/>
+          <w:color w:val="000000"/>
+        </w:rPr>
+      </w:pPr>
+      <w:proofErr w:type="spellStart"/>
+      <w:r>
+        <w:rPr>
+          <w:bCs/>
+          <w:color w:val="000000"/>
+        </w:rPr>
+        <w:t>elif</w:t>
+      </w:r>
+      <w:proofErr w:type="spellEnd"/>
+      <w:r>
+        <w:rPr>
+          <w:bCs/>
+          <w:color w:val="000000"/>
+        </w:rPr>
+        <w:t xml:space="preserve"> day == "SUNDAY":</w:t>
+      </w:r>
+    </w:p>
+    <w:p>
+      <w:pPr>
+        <w:spacing w:after="0" w:line="240" w:lineRule="auto"/>
+        <w:rPr>
+          <w:bCs/>
+          <w:color w:val="000000"/>
+        </w:rPr>
+      </w:pPr>
+      <w:r>
+        <w:rPr>
+          <w:bCs/>
+          <w:color w:val="000000"/>
+        </w:rPr>
+        <w:t xml:space="preserve">    </w:t>
+      </w:r>
+      <w:proofErr w:type="gramStart"/>
+      <w:r>
+        <w:rPr>
+          <w:bCs/>
+          <w:color w:val="000000"/>
+        </w:rPr>
+        <w:t>print(</w:t>
+      </w:r>
+      <w:proofErr w:type="gramEnd"/>
+      <w:r>
+        <w:rPr>
+          <w:bCs/>
+          <w:color w:val="000000"/>
+        </w:rPr>
+        <w:t>"Yay! It's a holiday")</w:t>
       </w:r>
     </w:p>
     <w:p>
@@ -3437,7 +4289,23 @@
           <w:bCs/>
           <w:color w:val="000000"/>
         </w:rPr>
-        <w:t>    print("Invalid day name")</w:t>
+        <w:t xml:space="preserve">    </w:t>
+      </w:r>
+      <w:proofErr w:type="gramStart"/>
+      <w:r>
+        <w:rPr>
+          <w:bCs/>
+          <w:color w:val="000000"/>
+        </w:rPr>
+        <w:t>print(</w:t>
+      </w:r>
+      <w:proofErr w:type="gramEnd"/>
+      <w:r>
+        <w:rPr>
+          <w:bCs/>
+          <w:color w:val="000000"/>
+        </w:rPr>
+        <w:t>"Invalid day name")</w:t>
       </w:r>
     </w:p>
     <w:p>
@@ -3575,7 +4443,23 @@
           <w:bCs/>
           <w:color w:val="000000"/>
         </w:rPr>
-        <w:t>age = int(input("Enter your age: "))</w:t>
+        <w:t xml:space="preserve">age = </w:t>
+      </w:r>
+      <w:proofErr w:type="gramStart"/>
+      <w:r>
+        <w:rPr>
+          <w:bCs/>
+          <w:color w:val="000000"/>
+        </w:rPr>
+        <w:t>int(input(</w:t>
+      </w:r>
+      <w:proofErr w:type="gramEnd"/>
+      <w:r>
+        <w:rPr>
+          <w:bCs/>
+          <w:color w:val="000000"/>
+        </w:rPr>
+        <w:t>"Enter your age: "))</w:t>
       </w:r>
     </w:p>
     <w:p>
@@ -4146,137 +5030,319 @@
           <w:bCs/>
           <w:color w:val="000000"/>
         </w:rPr>
-        <w:t>marks1 = float(input("Enter marks obtained in subject 1: "))</w:t>
-      </w:r>
-    </w:p>
-    <w:p>
-      <w:pPr>
-        <w:spacing w:after="0" w:line="240" w:lineRule="auto"/>
-        <w:rPr>
-          <w:bCs/>
-          <w:color w:val="000000"/>
-        </w:rPr>
-      </w:pPr>
-      <w:r>
-        <w:rPr>
-          <w:bCs/>
-          <w:color w:val="000000"/>
-        </w:rPr>
-        <w:t>marks2 = float(input("Enter marks obtained in subject 2: "))</w:t>
-      </w:r>
-    </w:p>
-    <w:p>
-      <w:pPr>
-        <w:spacing w:after="0" w:line="240" w:lineRule="auto"/>
-        <w:rPr>
-          <w:bCs/>
-          <w:color w:val="000000"/>
-        </w:rPr>
-      </w:pPr>
-      <w:r>
-        <w:rPr>
-          <w:bCs/>
-          <w:color w:val="000000"/>
-        </w:rPr>
-        <w:t>marks3 = float(input("Enter marks obtained in subject 3: "))</w:t>
-      </w:r>
-    </w:p>
-    <w:p>
-      <w:pPr>
-        <w:spacing w:after="0" w:line="240" w:lineRule="auto"/>
-        <w:rPr>
-          <w:bCs/>
-          <w:color w:val="000000"/>
-        </w:rPr>
-      </w:pPr>
-    </w:p>
-    <w:p>
-      <w:pPr>
-        <w:spacing w:after="0" w:line="240" w:lineRule="auto"/>
-        <w:rPr>
-          <w:bCs/>
-          <w:color w:val="000000"/>
-        </w:rPr>
-      </w:pPr>
-      <w:r>
-        <w:rPr>
-          <w:bCs/>
-          <w:color w:val="000000"/>
-        </w:rPr>
-        <w:t>total_marks = float(input("Enter total marks: "))</w:t>
-      </w:r>
-    </w:p>
-    <w:p>
-      <w:pPr>
-        <w:spacing w:after="0" w:line="240" w:lineRule="auto"/>
-        <w:rPr>
-          <w:bCs/>
-          <w:color w:val="000000"/>
-        </w:rPr>
-      </w:pPr>
-    </w:p>
-    <w:p>
-      <w:pPr>
-        <w:spacing w:after="0" w:line="240" w:lineRule="auto"/>
-        <w:rPr>
-          <w:bCs/>
-          <w:color w:val="000000"/>
-        </w:rPr>
-      </w:pPr>
-      <w:r>
-        <w:rPr>
-          <w:bCs/>
-          <w:color w:val="000000"/>
-        </w:rPr>
-        <w:t>total_obtained = marks1 + marks2 + marks3</w:t>
-      </w:r>
-    </w:p>
-    <w:p>
-      <w:pPr>
-        <w:spacing w:after="0" w:line="240" w:lineRule="auto"/>
-        <w:rPr>
-          <w:bCs/>
-          <w:color w:val="000000"/>
-        </w:rPr>
-      </w:pPr>
-      <w:r>
-        <w:rPr>
-          <w:bCs/>
-          <w:color w:val="000000"/>
-        </w:rPr>
-        <w:t>percentage = (total_obtained / total_marks) * 100</w:t>
-      </w:r>
-    </w:p>
-    <w:p>
-      <w:pPr>
-        <w:spacing w:after="0" w:line="240" w:lineRule="auto"/>
-        <w:rPr>
-          <w:bCs/>
-          <w:color w:val="000000"/>
-        </w:rPr>
-      </w:pPr>
-      <w:r>
-        <w:rPr>
-          <w:bCs/>
-          <w:color w:val="000000"/>
-        </w:rPr>
-        <w:t>print(f"Total Marks Obtained: {total_obtained}")</w:t>
-      </w:r>
-    </w:p>
-    <w:p>
-      <w:pPr>
-        <w:spacing w:after="0" w:line="240" w:lineRule="auto"/>
-        <w:rPr>
-          <w:bCs/>
-          <w:color w:val="000000"/>
-        </w:rPr>
-      </w:pPr>
-      <w:r>
-        <w:rPr>
-          <w:bCs/>
-          <w:color w:val="000000"/>
-        </w:rPr>
-        <w:t>print(f"Percentage: {percentage:.2f}%")</w:t>
+        <w:t xml:space="preserve">marks1 = </w:t>
+      </w:r>
+      <w:proofErr w:type="gramStart"/>
+      <w:r>
+        <w:rPr>
+          <w:bCs/>
+          <w:color w:val="000000"/>
+        </w:rPr>
+        <w:t>float(input(</w:t>
+      </w:r>
+      <w:proofErr w:type="gramEnd"/>
+      <w:r>
+        <w:rPr>
+          <w:bCs/>
+          <w:color w:val="000000"/>
+        </w:rPr>
+        <w:t>"Enter marks obtained in subject 1: "))</w:t>
+      </w:r>
+    </w:p>
+    <w:p>
+      <w:pPr>
+        <w:spacing w:after="0" w:line="240" w:lineRule="auto"/>
+        <w:rPr>
+          <w:bCs/>
+          <w:color w:val="000000"/>
+        </w:rPr>
+      </w:pPr>
+      <w:r>
+        <w:rPr>
+          <w:bCs/>
+          <w:color w:val="000000"/>
+        </w:rPr>
+        <w:t xml:space="preserve">marks2 = </w:t>
+      </w:r>
+      <w:proofErr w:type="gramStart"/>
+      <w:r>
+        <w:rPr>
+          <w:bCs/>
+          <w:color w:val="000000"/>
+        </w:rPr>
+        <w:t>float(input(</w:t>
+      </w:r>
+      <w:proofErr w:type="gramEnd"/>
+      <w:r>
+        <w:rPr>
+          <w:bCs/>
+          <w:color w:val="000000"/>
+        </w:rPr>
+        <w:t>"Enter marks obtained in subject 2: "))</w:t>
+      </w:r>
+    </w:p>
+    <w:p>
+      <w:pPr>
+        <w:spacing w:after="0" w:line="240" w:lineRule="auto"/>
+        <w:rPr>
+          <w:bCs/>
+          <w:color w:val="000000"/>
+        </w:rPr>
+      </w:pPr>
+      <w:r>
+        <w:rPr>
+          <w:bCs/>
+          <w:color w:val="000000"/>
+        </w:rPr>
+        <w:t xml:space="preserve">marks3 = </w:t>
+      </w:r>
+      <w:proofErr w:type="gramStart"/>
+      <w:r>
+        <w:rPr>
+          <w:bCs/>
+          <w:color w:val="000000"/>
+        </w:rPr>
+        <w:t>float(input(</w:t>
+      </w:r>
+      <w:proofErr w:type="gramEnd"/>
+      <w:r>
+        <w:rPr>
+          <w:bCs/>
+          <w:color w:val="000000"/>
+        </w:rPr>
+        <w:t>"Enter marks obtained in subject 3: "))</w:t>
+      </w:r>
+    </w:p>
+    <w:p>
+      <w:pPr>
+        <w:spacing w:after="0" w:line="240" w:lineRule="auto"/>
+        <w:rPr>
+          <w:bCs/>
+          <w:color w:val="000000"/>
+        </w:rPr>
+      </w:pPr>
+    </w:p>
+    <w:p>
+      <w:pPr>
+        <w:spacing w:after="0" w:line="240" w:lineRule="auto"/>
+        <w:rPr>
+          <w:bCs/>
+          <w:color w:val="000000"/>
+        </w:rPr>
+      </w:pPr>
+      <w:proofErr w:type="spellStart"/>
+      <w:r>
+        <w:rPr>
+          <w:bCs/>
+          <w:color w:val="000000"/>
+        </w:rPr>
+        <w:t>total_marks</w:t>
+      </w:r>
+      <w:proofErr w:type="spellEnd"/>
+      <w:r>
+        <w:rPr>
+          <w:bCs/>
+          <w:color w:val="000000"/>
+        </w:rPr>
+        <w:t xml:space="preserve"> = </w:t>
+      </w:r>
+      <w:proofErr w:type="gramStart"/>
+      <w:r>
+        <w:rPr>
+          <w:bCs/>
+          <w:color w:val="000000"/>
+        </w:rPr>
+        <w:t>float(input(</w:t>
+      </w:r>
+      <w:proofErr w:type="gramEnd"/>
+      <w:r>
+        <w:rPr>
+          <w:bCs/>
+          <w:color w:val="000000"/>
+        </w:rPr>
+        <w:t>"Enter total marks: "))</w:t>
+      </w:r>
+    </w:p>
+    <w:p>
+      <w:pPr>
+        <w:spacing w:after="0" w:line="240" w:lineRule="auto"/>
+        <w:rPr>
+          <w:bCs/>
+          <w:color w:val="000000"/>
+        </w:rPr>
+      </w:pPr>
+    </w:p>
+    <w:p>
+      <w:pPr>
+        <w:spacing w:after="0" w:line="240" w:lineRule="auto"/>
+        <w:rPr>
+          <w:bCs/>
+          <w:color w:val="000000"/>
+        </w:rPr>
+      </w:pPr>
+      <w:proofErr w:type="spellStart"/>
+      <w:r>
+        <w:rPr>
+          <w:bCs/>
+          <w:color w:val="000000"/>
+        </w:rPr>
+        <w:t>total_obtained</w:t>
+      </w:r>
+      <w:proofErr w:type="spellEnd"/>
+      <w:r>
+        <w:rPr>
+          <w:bCs/>
+          <w:color w:val="000000"/>
+        </w:rPr>
+        <w:t xml:space="preserve"> = marks1 + marks2 + marks3</w:t>
+      </w:r>
+    </w:p>
+    <w:p>
+      <w:pPr>
+        <w:spacing w:after="0" w:line="240" w:lineRule="auto"/>
+        <w:rPr>
+          <w:bCs/>
+          <w:color w:val="000000"/>
+        </w:rPr>
+      </w:pPr>
+      <w:r>
+        <w:rPr>
+          <w:bCs/>
+          <w:color w:val="000000"/>
+        </w:rPr>
+        <w:t>percentage = (</w:t>
+      </w:r>
+      <w:proofErr w:type="spellStart"/>
+      <w:r>
+        <w:rPr>
+          <w:bCs/>
+          <w:color w:val="000000"/>
+        </w:rPr>
+        <w:t>total_obtained</w:t>
+      </w:r>
+      <w:proofErr w:type="spellEnd"/>
+      <w:r>
+        <w:rPr>
+          <w:bCs/>
+          <w:color w:val="000000"/>
+        </w:rPr>
+        <w:t xml:space="preserve"> / </w:t>
+      </w:r>
+      <w:proofErr w:type="spellStart"/>
+      <w:r>
+        <w:rPr>
+          <w:bCs/>
+          <w:color w:val="000000"/>
+        </w:rPr>
+        <w:t>total_marks</w:t>
+      </w:r>
+      <w:proofErr w:type="spellEnd"/>
+      <w:r>
+        <w:rPr>
+          <w:bCs/>
+          <w:color w:val="000000"/>
+        </w:rPr>
+        <w:t>) * 100</w:t>
+      </w:r>
+    </w:p>
+    <w:p>
+      <w:pPr>
+        <w:spacing w:after="0" w:line="240" w:lineRule="auto"/>
+        <w:rPr>
+          <w:bCs/>
+          <w:color w:val="000000"/>
+        </w:rPr>
+      </w:pPr>
+      <w:proofErr w:type="gramStart"/>
+      <w:r>
+        <w:rPr>
+          <w:bCs/>
+          <w:color w:val="000000"/>
+        </w:rPr>
+        <w:t>print(</w:t>
+      </w:r>
+      <w:proofErr w:type="spellStart"/>
+      <w:proofErr w:type="gramEnd"/>
+      <w:r>
+        <w:rPr>
+          <w:bCs/>
+          <w:color w:val="000000"/>
+        </w:rPr>
+        <w:t>f"Total</w:t>
+      </w:r>
+      <w:proofErr w:type="spellEnd"/>
+      <w:r>
+        <w:rPr>
+          <w:bCs/>
+          <w:color w:val="000000"/>
+        </w:rPr>
+        <w:t xml:space="preserve"> Marks Obtained: {</w:t>
+      </w:r>
+      <w:proofErr w:type="spellStart"/>
+      <w:r>
+        <w:rPr>
+          <w:bCs/>
+          <w:color w:val="000000"/>
+        </w:rPr>
+        <w:t>total_obtained</w:t>
+      </w:r>
+      <w:proofErr w:type="spellEnd"/>
+      <w:r>
+        <w:rPr>
+          <w:bCs/>
+          <w:color w:val="000000"/>
+        </w:rPr>
+        <w:t>}")</w:t>
+      </w:r>
+    </w:p>
+    <w:p>
+      <w:pPr>
+        <w:spacing w:after="0" w:line="240" w:lineRule="auto"/>
+        <w:rPr>
+          <w:bCs/>
+          <w:color w:val="000000"/>
+        </w:rPr>
+      </w:pPr>
+      <w:proofErr w:type="gramStart"/>
+      <w:r>
+        <w:rPr>
+          <w:bCs/>
+          <w:color w:val="000000"/>
+        </w:rPr>
+        <w:t>print(</w:t>
+      </w:r>
+      <w:proofErr w:type="spellStart"/>
+      <w:proofErr w:type="gramEnd"/>
+      <w:r>
+        <w:rPr>
+          <w:bCs/>
+          <w:color w:val="000000"/>
+        </w:rPr>
+        <w:t>f"Percentage</w:t>
+      </w:r>
+      <w:proofErr w:type="spellEnd"/>
+      <w:r>
+        <w:rPr>
+          <w:bCs/>
+          <w:color w:val="000000"/>
+        </w:rPr>
+        <w:t>: {percentage:.2</w:t>
+      </w:r>
+      <w:proofErr w:type="gramStart"/>
+      <w:r>
+        <w:rPr>
+          <w:bCs/>
+          <w:color w:val="000000"/>
+        </w:rPr>
+        <w:t>f}%</w:t>
+      </w:r>
+      <w:proofErr w:type="gramEnd"/>
+      <w:r>
+        <w:rPr>
+          <w:bCs/>
+          <w:color w:val="000000"/>
+        </w:rPr>
+        <w:t>")</w:t>
       </w:r>
     </w:p>
     <w:p>
@@ -4317,119 +5383,233 @@
           <w:bCs/>
           <w:color w:val="000000"/>
         </w:rPr>
-        <w:t>    print("Grade: A-one")</w:t>
-      </w:r>
-    </w:p>
-    <w:p>
-      <w:pPr>
-        <w:spacing w:after="0" w:line="240" w:lineRule="auto"/>
-        <w:rPr>
-          <w:bCs/>
-          <w:color w:val="000000"/>
-        </w:rPr>
-      </w:pPr>
-      <w:r>
-        <w:rPr>
-          <w:bCs/>
-          <w:color w:val="000000"/>
-        </w:rPr>
-        <w:t>    print("Remarks: Excellent")</w:t>
-      </w:r>
-    </w:p>
-    <w:p>
-      <w:pPr>
-        <w:spacing w:after="0" w:line="240" w:lineRule="auto"/>
-        <w:rPr>
-          <w:bCs/>
-          <w:color w:val="000000"/>
-        </w:rPr>
-      </w:pPr>
-      <w:r>
-        <w:rPr>
-          <w:bCs/>
-          <w:color w:val="000000"/>
-        </w:rPr>
-        <w:t>elif percentage &gt;= 70:</w:t>
-      </w:r>
-    </w:p>
-    <w:p>
-      <w:pPr>
-        <w:spacing w:after="0" w:line="240" w:lineRule="auto"/>
-        <w:rPr>
-          <w:bCs/>
-          <w:color w:val="000000"/>
-        </w:rPr>
-      </w:pPr>
-      <w:r>
-        <w:rPr>
-          <w:bCs/>
-          <w:color w:val="000000"/>
-        </w:rPr>
-        <w:t>    print("Grade: A")</w:t>
-      </w:r>
-    </w:p>
-    <w:p>
-      <w:pPr>
-        <w:spacing w:after="0" w:line="240" w:lineRule="auto"/>
-        <w:rPr>
-          <w:bCs/>
-          <w:color w:val="000000"/>
-        </w:rPr>
-      </w:pPr>
-      <w:r>
-        <w:rPr>
-          <w:bCs/>
-          <w:color w:val="000000"/>
-        </w:rPr>
-        <w:t>    print("Remarks: Good")</w:t>
-      </w:r>
-    </w:p>
-    <w:p>
-      <w:pPr>
-        <w:spacing w:after="0" w:line="240" w:lineRule="auto"/>
-        <w:rPr>
-          <w:bCs/>
-          <w:color w:val="000000"/>
-        </w:rPr>
-      </w:pPr>
-      <w:r>
-        <w:rPr>
-          <w:bCs/>
-          <w:color w:val="000000"/>
-        </w:rPr>
-        <w:t>elif percentage &gt;= 60:</w:t>
-      </w:r>
-    </w:p>
-    <w:p>
-      <w:pPr>
-        <w:spacing w:after="0" w:line="240" w:lineRule="auto"/>
-        <w:rPr>
-          <w:bCs/>
-          <w:color w:val="000000"/>
-        </w:rPr>
-      </w:pPr>
-      <w:r>
-        <w:rPr>
-          <w:bCs/>
-          <w:color w:val="000000"/>
-        </w:rPr>
-        <w:t>    print("Grade: B")</w:t>
-      </w:r>
-    </w:p>
-    <w:p>
-      <w:pPr>
-        <w:spacing w:after="0" w:line="240" w:lineRule="auto"/>
-        <w:rPr>
-          <w:bCs/>
-          <w:color w:val="000000"/>
-        </w:rPr>
-      </w:pPr>
-      <w:r>
-        <w:rPr>
-          <w:bCs/>
-          <w:color w:val="000000"/>
-        </w:rPr>
-        <w:t>    print("Remarks: You need to improve")</w:t>
+        <w:t xml:space="preserve">    </w:t>
+      </w:r>
+      <w:proofErr w:type="gramStart"/>
+      <w:r>
+        <w:rPr>
+          <w:bCs/>
+          <w:color w:val="000000"/>
+        </w:rPr>
+        <w:t>print(</w:t>
+      </w:r>
+      <w:proofErr w:type="gramEnd"/>
+      <w:r>
+        <w:rPr>
+          <w:bCs/>
+          <w:color w:val="000000"/>
+        </w:rPr>
+        <w:t>"Grade: A-one")</w:t>
+      </w:r>
+    </w:p>
+    <w:p>
+      <w:pPr>
+        <w:spacing w:after="0" w:line="240" w:lineRule="auto"/>
+        <w:rPr>
+          <w:bCs/>
+          <w:color w:val="000000"/>
+        </w:rPr>
+      </w:pPr>
+      <w:r>
+        <w:rPr>
+          <w:bCs/>
+          <w:color w:val="000000"/>
+        </w:rPr>
+        <w:t xml:space="preserve">    </w:t>
+      </w:r>
+      <w:proofErr w:type="gramStart"/>
+      <w:r>
+        <w:rPr>
+          <w:bCs/>
+          <w:color w:val="000000"/>
+        </w:rPr>
+        <w:t>print(</w:t>
+      </w:r>
+      <w:proofErr w:type="gramEnd"/>
+      <w:r>
+        <w:rPr>
+          <w:bCs/>
+          <w:color w:val="000000"/>
+        </w:rPr>
+        <w:t>"Remarks: Excellent")</w:t>
+      </w:r>
+    </w:p>
+    <w:p>
+      <w:pPr>
+        <w:spacing w:after="0" w:line="240" w:lineRule="auto"/>
+        <w:rPr>
+          <w:bCs/>
+          <w:color w:val="000000"/>
+        </w:rPr>
+      </w:pPr>
+      <w:proofErr w:type="spellStart"/>
+      <w:r>
+        <w:rPr>
+          <w:bCs/>
+          <w:color w:val="000000"/>
+        </w:rPr>
+        <w:t>elif</w:t>
+      </w:r>
+      <w:proofErr w:type="spellEnd"/>
+      <w:r>
+        <w:rPr>
+          <w:bCs/>
+          <w:color w:val="000000"/>
+        </w:rPr>
+        <w:t xml:space="preserve"> percentage &gt;= 70:</w:t>
+      </w:r>
+    </w:p>
+    <w:p>
+      <w:pPr>
+        <w:spacing w:after="0" w:line="240" w:lineRule="auto"/>
+        <w:rPr>
+          <w:bCs/>
+          <w:color w:val="000000"/>
+        </w:rPr>
+      </w:pPr>
+      <w:r>
+        <w:rPr>
+          <w:bCs/>
+          <w:color w:val="000000"/>
+        </w:rPr>
+        <w:t xml:space="preserve">    </w:t>
+      </w:r>
+      <w:proofErr w:type="gramStart"/>
+      <w:r>
+        <w:rPr>
+          <w:bCs/>
+          <w:color w:val="000000"/>
+        </w:rPr>
+        <w:t>print(</w:t>
+      </w:r>
+      <w:proofErr w:type="gramEnd"/>
+      <w:r>
+        <w:rPr>
+          <w:bCs/>
+          <w:color w:val="000000"/>
+        </w:rPr>
+        <w:t>"Grade: A")</w:t>
+      </w:r>
+    </w:p>
+    <w:p>
+      <w:pPr>
+        <w:spacing w:after="0" w:line="240" w:lineRule="auto"/>
+        <w:rPr>
+          <w:bCs/>
+          <w:color w:val="000000"/>
+        </w:rPr>
+      </w:pPr>
+      <w:r>
+        <w:rPr>
+          <w:bCs/>
+          <w:color w:val="000000"/>
+        </w:rPr>
+        <w:t xml:space="preserve">    </w:t>
+      </w:r>
+      <w:proofErr w:type="gramStart"/>
+      <w:r>
+        <w:rPr>
+          <w:bCs/>
+          <w:color w:val="000000"/>
+        </w:rPr>
+        <w:t>print(</w:t>
+      </w:r>
+      <w:proofErr w:type="gramEnd"/>
+      <w:r>
+        <w:rPr>
+          <w:bCs/>
+          <w:color w:val="000000"/>
+        </w:rPr>
+        <w:t>"Remarks: Good")</w:t>
+      </w:r>
+    </w:p>
+    <w:p>
+      <w:pPr>
+        <w:spacing w:after="0" w:line="240" w:lineRule="auto"/>
+        <w:rPr>
+          <w:bCs/>
+          <w:color w:val="000000"/>
+        </w:rPr>
+      </w:pPr>
+      <w:proofErr w:type="spellStart"/>
+      <w:r>
+        <w:rPr>
+          <w:bCs/>
+          <w:color w:val="000000"/>
+        </w:rPr>
+        <w:t>elif</w:t>
+      </w:r>
+      <w:proofErr w:type="spellEnd"/>
+      <w:r>
+        <w:rPr>
+          <w:bCs/>
+          <w:color w:val="000000"/>
+        </w:rPr>
+        <w:t xml:space="preserve"> percentage &gt;= 60:</w:t>
+      </w:r>
+    </w:p>
+    <w:p>
+      <w:pPr>
+        <w:spacing w:after="0" w:line="240" w:lineRule="auto"/>
+        <w:rPr>
+          <w:bCs/>
+          <w:color w:val="000000"/>
+        </w:rPr>
+      </w:pPr>
+      <w:r>
+        <w:rPr>
+          <w:bCs/>
+          <w:color w:val="000000"/>
+        </w:rPr>
+        <w:t xml:space="preserve">    </w:t>
+      </w:r>
+      <w:proofErr w:type="gramStart"/>
+      <w:r>
+        <w:rPr>
+          <w:bCs/>
+          <w:color w:val="000000"/>
+        </w:rPr>
+        <w:t>print(</w:t>
+      </w:r>
+      <w:proofErr w:type="gramEnd"/>
+      <w:r>
+        <w:rPr>
+          <w:bCs/>
+          <w:color w:val="000000"/>
+        </w:rPr>
+        <w:t>"Grade: B")</w:t>
+      </w:r>
+    </w:p>
+    <w:p>
+      <w:pPr>
+        <w:spacing w:after="0" w:line="240" w:lineRule="auto"/>
+        <w:rPr>
+          <w:bCs/>
+          <w:color w:val="000000"/>
+        </w:rPr>
+      </w:pPr>
+      <w:r>
+        <w:rPr>
+          <w:bCs/>
+          <w:color w:val="000000"/>
+        </w:rPr>
+        <w:t xml:space="preserve">    </w:t>
+      </w:r>
+      <w:proofErr w:type="gramStart"/>
+      <w:r>
+        <w:rPr>
+          <w:bCs/>
+          <w:color w:val="000000"/>
+        </w:rPr>
+        <w:t>print(</w:t>
+      </w:r>
+      <w:proofErr w:type="gramEnd"/>
+      <w:r>
+        <w:rPr>
+          <w:bCs/>
+          <w:color w:val="000000"/>
+        </w:rPr>
+        <w:t>"Remarks: You need to improve")</w:t>
       </w:r>
     </w:p>
     <w:p>
@@ -4461,23 +5641,55 @@
           <w:bCs/>
           <w:color w:val="000000"/>
         </w:rPr>
-        <w:t>    print("Grade: Fail")</w:t>
-      </w:r>
-    </w:p>
-    <w:p>
-      <w:pPr>
-        <w:spacing w:after="0" w:line="240" w:lineRule="auto"/>
-        <w:rPr>
-          <w:bCs/>
-          <w:color w:val="000000"/>
-        </w:rPr>
-      </w:pPr>
-      <w:r>
-        <w:rPr>
-          <w:bCs/>
-          <w:color w:val="000000"/>
-        </w:rPr>
-        <w:t>    print("Remarks: Sorry")</w:t>
+        <w:t xml:space="preserve">    </w:t>
+      </w:r>
+      <w:proofErr w:type="gramStart"/>
+      <w:r>
+        <w:rPr>
+          <w:bCs/>
+          <w:color w:val="000000"/>
+        </w:rPr>
+        <w:t>print(</w:t>
+      </w:r>
+      <w:proofErr w:type="gramEnd"/>
+      <w:r>
+        <w:rPr>
+          <w:bCs/>
+          <w:color w:val="000000"/>
+        </w:rPr>
+        <w:t>"Grade: Fail")</w:t>
+      </w:r>
+    </w:p>
+    <w:p>
+      <w:pPr>
+        <w:spacing w:after="0" w:line="240" w:lineRule="auto"/>
+        <w:rPr>
+          <w:bCs/>
+          <w:color w:val="000000"/>
+        </w:rPr>
+      </w:pPr>
+      <w:r>
+        <w:rPr>
+          <w:bCs/>
+          <w:color w:val="000000"/>
+        </w:rPr>
+        <w:t xml:space="preserve">    </w:t>
+      </w:r>
+      <w:proofErr w:type="gramStart"/>
+      <w:r>
+        <w:rPr>
+          <w:bCs/>
+          <w:color w:val="000000"/>
+        </w:rPr>
+        <w:t>print(</w:t>
+      </w:r>
+      <w:proofErr w:type="gramEnd"/>
+      <w:r>
+        <w:rPr>
+          <w:bCs/>
+          <w:color w:val="000000"/>
+        </w:rPr>
+        <w:t>"Remarks: Sorry")</w:t>
       </w:r>
     </w:p>
     <w:p>
@@ -4579,7 +5791,23 @@
           <w:bCs/>
           <w:color w:val="000000"/>
         </w:rPr>
-        <w:t>num = float(input("Enter a positive number: "))</w:t>
+        <w:t xml:space="preserve">num = </w:t>
+      </w:r>
+      <w:proofErr w:type="gramStart"/>
+      <w:r>
+        <w:rPr>
+          <w:bCs/>
+          <w:color w:val="000000"/>
+        </w:rPr>
+        <w:t>float(input(</w:t>
+      </w:r>
+      <w:proofErr w:type="gramEnd"/>
+      <w:r>
+        <w:rPr>
+          <w:bCs/>
+          <w:color w:val="000000"/>
+        </w:rPr>
+        <w:t>"Enter a positive number: "))</w:t>
       </w:r>
     </w:p>
     <w:p>
@@ -5034,39 +6262,103 @@
           <w:bCs/>
           <w:color w:val="000000"/>
         </w:rPr>
-        <w:t>for i in range(1, 21):</w:t>
-      </w:r>
-    </w:p>
-    <w:p>
-      <w:pPr>
-        <w:spacing w:after="0" w:line="240" w:lineRule="auto"/>
-        <w:rPr>
-          <w:bCs/>
-          <w:color w:val="000000"/>
-        </w:rPr>
-      </w:pPr>
-      <w:r>
-        <w:rPr>
-          <w:bCs/>
-          <w:color w:val="000000"/>
-        </w:rPr>
-        <w:t>    if i % 2 == 0:</w:t>
-      </w:r>
-    </w:p>
-    <w:p>
-      <w:pPr>
-        <w:spacing w:after="0" w:line="240" w:lineRule="auto"/>
-        <w:rPr>
-          <w:bCs/>
-          <w:color w:val="000000"/>
-        </w:rPr>
-      </w:pPr>
-      <w:r>
-        <w:rPr>
-          <w:bCs/>
-          <w:color w:val="000000"/>
-        </w:rPr>
-        <w:t>        print(f"{i} is Even")</w:t>
+        <w:t xml:space="preserve">for </w:t>
+      </w:r>
+      <w:proofErr w:type="spellStart"/>
+      <w:r>
+        <w:rPr>
+          <w:bCs/>
+          <w:color w:val="000000"/>
+        </w:rPr>
+        <w:t>i</w:t>
+      </w:r>
+      <w:proofErr w:type="spellEnd"/>
+      <w:r>
+        <w:rPr>
+          <w:bCs/>
+          <w:color w:val="000000"/>
+        </w:rPr>
+        <w:t xml:space="preserve"> in </w:t>
+      </w:r>
+      <w:proofErr w:type="gramStart"/>
+      <w:r>
+        <w:rPr>
+          <w:bCs/>
+          <w:color w:val="000000"/>
+        </w:rPr>
+        <w:t>range(</w:t>
+      </w:r>
+      <w:proofErr w:type="gramEnd"/>
+      <w:r>
+        <w:rPr>
+          <w:bCs/>
+          <w:color w:val="000000"/>
+        </w:rPr>
+        <w:t>1, 21):</w:t>
+      </w:r>
+    </w:p>
+    <w:p>
+      <w:pPr>
+        <w:spacing w:after="0" w:line="240" w:lineRule="auto"/>
+        <w:rPr>
+          <w:bCs/>
+          <w:color w:val="000000"/>
+        </w:rPr>
+      </w:pPr>
+      <w:r>
+        <w:rPr>
+          <w:bCs/>
+          <w:color w:val="000000"/>
+        </w:rPr>
+        <w:t xml:space="preserve">    if </w:t>
+      </w:r>
+      <w:proofErr w:type="spellStart"/>
+      <w:r>
+        <w:rPr>
+          <w:bCs/>
+          <w:color w:val="000000"/>
+        </w:rPr>
+        <w:t>i</w:t>
+      </w:r>
+      <w:proofErr w:type="spellEnd"/>
+      <w:r>
+        <w:rPr>
+          <w:bCs/>
+          <w:color w:val="000000"/>
+        </w:rPr>
+        <w:t xml:space="preserve"> % 2 == 0:</w:t>
+      </w:r>
+    </w:p>
+    <w:p>
+      <w:pPr>
+        <w:spacing w:after="0" w:line="240" w:lineRule="auto"/>
+        <w:rPr>
+          <w:bCs/>
+          <w:color w:val="000000"/>
+        </w:rPr>
+      </w:pPr>
+      <w:r>
+        <w:rPr>
+          <w:bCs/>
+          <w:color w:val="000000"/>
+        </w:rPr>
+        <w:t>        print(f"{</w:t>
+      </w:r>
+      <w:proofErr w:type="spellStart"/>
+      <w:r>
+        <w:rPr>
+          <w:bCs/>
+          <w:color w:val="000000"/>
+        </w:rPr>
+        <w:t>i</w:t>
+      </w:r>
+      <w:proofErr w:type="spellEnd"/>
+      <w:r>
+        <w:rPr>
+          <w:bCs/>
+          <w:color w:val="000000"/>
+        </w:rPr>
+        <w:t>} is Even")</w:t>
       </w:r>
     </w:p>
     <w:p>
@@ -5098,7 +6390,23 @@
           <w:bCs/>
           <w:color w:val="000000"/>
         </w:rPr>
-        <w:t>        print(f"{i} is Odd")</w:t>
+        <w:t>        print(f"{</w:t>
+      </w:r>
+      <w:proofErr w:type="spellStart"/>
+      <w:r>
+        <w:rPr>
+          <w:bCs/>
+          <w:color w:val="000000"/>
+        </w:rPr>
+        <w:t>i</w:t>
+      </w:r>
+      <w:proofErr w:type="spellEnd"/>
+      <w:r>
+        <w:rPr>
+          <w:bCs/>
+          <w:color w:val="000000"/>
+        </w:rPr>
+        <w:t>} is Odd")</w:t>
       </w:r>
     </w:p>
     <w:p>
@@ -5154,25 +6462,12 @@
       <w:pStyle w:val="Footer"/>
       <w:jc w:val="center"/>
     </w:pPr>
-  </w:p>
-  <w:p>
-    <w:pPr>
-      <w:pBdr>
-        <w:top w:val="nil"/>
-        <w:left w:val="nil"/>
-        <w:bottom w:val="nil"/>
-        <w:right w:val="nil"/>
-        <w:between w:val="nil"/>
-      </w:pBdr>
-      <w:tabs>
-        <w:tab w:val="center" w:pos="4680"/>
-        <w:tab w:val="right" w:pos="9360"/>
-      </w:tabs>
-      <w:spacing w:after="0" w:line="240" w:lineRule="auto"/>
-      <w:rPr>
-        <w:color w:val="000000"/>
-      </w:rPr>
-    </w:pPr>
+    <w:r>
+      <w:t>Bishal Rijal</w:t>
+    </w:r>
+    <w:r>
+      <w:t>, Roll No. 6 (Six)</w:t>
+    </w:r>
   </w:p>
 </w:ftr>
 </file>
@@ -6317,28 +7612,28 @@
 </file>
 
 <file path=customXml/item1.xml><?xml version="1.0" encoding="utf-8"?>
-<b:Sources xmlns:b="http://schemas.openxmlformats.org/officeDocument/2006/bibliography" xmlns="http://schemas.openxmlformats.org/officeDocument/2006/bibliography" SelectedStyle="\APASixthEditionOfficeOnline.xsl" StyleName="APA" Version="6"/>
-</file>
-
-<file path=customXml/item2.xml><?xml version="1.0" encoding="utf-8"?>
 <go:gDocsCustomXmlDataStorage xmlns:go="http://customooxmlschemas.google.com/" xmlns:r="http://schemas.openxmlformats.org/officeDocument/2006/relationships" uri="GoogleDocsCustomDataVersion2">
   <go:docsCustomData xmlns:go="http://customooxmlschemas.google.com/" roundtripDataSignature="AMtx7mhNdRNjg0bVM+xvUCna7odF+TVm+w==">CgMxLjAyCGguZ2pkZ3hzOAByITE1eGM4dkVsTTF2T0t5TEcySXJURWw4aFNGeFh5WmJHRQ==</go:docsCustomData>
 </go:gDocsCustomXmlDataStorage>
 </file>
 
-<file path=customXml/itemProps1.xml><?xml version="1.0" encoding="utf-8"?>
-<ds:datastoreItem xmlns:ds="http://schemas.openxmlformats.org/officeDocument/2006/customXml" ds:itemID="{794EAF63-1631-48A4-9EEB-A95A78F193C5}">
-  <ds:schemaRefs>
-    <ds:schemaRef ds:uri="http://schemas.openxmlformats.org/officeDocument/2006/bibliography"/>
-  </ds:schemaRefs>
-</ds:datastoreItem>
+<file path=customXml/item2.xml><?xml version="1.0" encoding="utf-8"?>
+<b:Sources xmlns:b="http://schemas.openxmlformats.org/officeDocument/2006/bibliography" xmlns="http://schemas.openxmlformats.org/officeDocument/2006/bibliography" SelectedStyle="\APASixthEditionOfficeOnline.xsl" StyleName="APA" Version="6"/>
 </file>
 
-<file path=customXml/itemProps2.xml><?xml version="1.0" encoding="utf-8"?>
+<file path=customXml/itemProps1.xml><?xml version="1.0" encoding="utf-8"?>
 <ds:datastoreItem xmlns:ds="http://schemas.openxmlformats.org/officeDocument/2006/customXml" ds:itemID="{11111111-1234-1234-1234-123412341234}">
   <ds:schemaRefs>
     <ds:schemaRef ds:uri="http://customooxmlschemas.google.com/"/>
     <ds:schemaRef ds:uri="http://schemas.openxmlformats.org/officeDocument/2006/relationships"/>
   </ds:schemaRefs>
 </ds:datastoreItem>
+</file>
+
+<file path=customXml/itemProps2.xml><?xml version="1.0" encoding="utf-8"?>
+<ds:datastoreItem xmlns:ds="http://schemas.openxmlformats.org/officeDocument/2006/customXml" ds:itemID="{794EAF63-1631-48A4-9EEB-A95A78F193C5}">
+  <ds:schemaRefs>
+    <ds:schemaRef ds:uri="http://schemas.openxmlformats.org/officeDocument/2006/bibliography"/>
+  </ds:schemaRefs>
+</ds:datastoreItem>
 </file>
</xml_diff>